<commit_message>
Change about page and Hamel interview
</commit_message>
<xml_diff>
--- a/Narrative Vita.docx
+++ b/Narrative Vita.docx
@@ -220,43 +220,41 @@
           <w:sz w:val="24"/>
           <w:szCs w:val="24"/>
         </w:rPr>
-        <w:t xml:space="preserve">At JPL, I met David Birch, who was a doctoral student at Harvard Business School. He was writing his doctoral dissertation on the systems engineering processes at JPL. David opened my eyes to management education and, on the </w:t>
-      </w:r>
-      <w:proofErr w:type="gramStart"/>
-      <w:r>
-        <w:rPr>
-          <w:rFonts w:asciiTheme="minorHAnsi" w:hAnsiTheme="minorHAnsi" w:cs="Courier New"/>
-          <w:sz w:val="24"/>
-          <w:szCs w:val="24"/>
-        </w:rPr>
-        <w:t>side</w:t>
-      </w:r>
-      <w:proofErr w:type="gramEnd"/>
-      <w:r>
-        <w:rPr>
-          <w:rFonts w:asciiTheme="minorHAnsi" w:hAnsiTheme="minorHAnsi" w:cs="Courier New"/>
-          <w:sz w:val="24"/>
-          <w:szCs w:val="24"/>
-        </w:rPr>
-        <w:t xml:space="preserve">, introduced me to rock climbing and, later, to cross-country skiing. </w:t>
-      </w:r>
-    </w:p>
-    <w:p>
-      <w:pPr>
-        <w:pStyle w:val="PlainText"/>
-        <w:rPr>
-          <w:rFonts w:asciiTheme="minorHAnsi" w:hAnsiTheme="minorHAnsi" w:cs="Courier New"/>
-          <w:sz w:val="24"/>
-          <w:szCs w:val="24"/>
-        </w:rPr>
-      </w:pPr>
-      <w:r>
-        <w:rPr>
-          <w:rFonts w:asciiTheme="minorHAnsi" w:hAnsiTheme="minorHAnsi" w:cs="Courier New"/>
-          <w:sz w:val="24"/>
-          <w:szCs w:val="24"/>
-        </w:rPr>
-        <w:t xml:space="preserve">At JPL, I came to deeply respect the project managers. They were not only managers but also talented at hands-on engineering. When something went wrong at Cape Canaveral, it was the project manager who flew out to fix it. I wanted to be the project manager for the manned Mars project, which we all thought would launch in 1984-85. Accordingly, I left JPL to study management. I applied to the doctoral programs (I already had a master's degree) at MIT and the Harvard Business School. Harvard’s fellowship was $500 larger, so I went there. </w:t>
+        <w:t xml:space="preserve">At JPL, I met David Birch, who was a doctoral student at Harvard Business School. He was writing his doctoral dissertation on the systems engineering processes at JPL. David opened my eyes to management education and, on the side, introduced me to rock climbing and, later, to cross-country skiing. </w:t>
+      </w:r>
+    </w:p>
+    <w:p>
+      <w:pPr>
+        <w:pStyle w:val="PlainText"/>
+        <w:rPr>
+          <w:rFonts w:asciiTheme="minorHAnsi" w:hAnsiTheme="minorHAnsi" w:cs="Courier New"/>
+          <w:sz w:val="24"/>
+          <w:szCs w:val="24"/>
+        </w:rPr>
+      </w:pPr>
+      <w:r>
+        <w:rPr>
+          <w:rFonts w:asciiTheme="minorHAnsi" w:hAnsiTheme="minorHAnsi" w:cs="Courier New"/>
+          <w:sz w:val="24"/>
+          <w:szCs w:val="24"/>
+        </w:rPr>
+        <w:t xml:space="preserve">At JPL, I came </w:t>
+      </w:r>
+      <w:r>
+        <w:rPr>
+          <w:rFonts w:asciiTheme="minorHAnsi" w:hAnsiTheme="minorHAnsi" w:cs="Courier New"/>
+          <w:sz w:val="24"/>
+          <w:szCs w:val="24"/>
+        </w:rPr>
+        <w:t>to respect the project managers deeply</w:t>
+      </w:r>
+      <w:r>
+        <w:rPr>
+          <w:rFonts w:asciiTheme="minorHAnsi" w:hAnsiTheme="minorHAnsi" w:cs="Courier New"/>
+          <w:sz w:val="24"/>
+          <w:szCs w:val="24"/>
+        </w:rPr>
+        <w:t xml:space="preserve">. They were not only managers but also talented at hands-on engineering. When something went wrong at Cape Canaveral, it was the project manager who flew out to fix it. I wanted to be the project manager for the manned Mars project, which we all thought would launch in 1984-85. Accordingly, I left JPL to study management. I applied to the doctoral programs (I already had a master's degree) at MIT and the Harvard Business School. Harvard’s fellowship was $500 larger, so I went there. </w:t>
       </w:r>
     </w:p>
     <w:p>
@@ -282,25 +280,7 @@
           <w:sz w:val="24"/>
           <w:szCs w:val="24"/>
         </w:rPr>
-        <w:t xml:space="preserve">I first majored in decision sciences, with Howard Raiffa being my mentor. After two years, I switched over to study general management and strategy. I was reasonably good at the decision sciences material, and that has helped me ever since. But I found the issues of how to structure difficult, unstructured situations more interesting. My mentors </w:t>
-      </w:r>
-      <w:proofErr w:type="gramStart"/>
-      <w:r>
-        <w:rPr>
-          <w:rFonts w:asciiTheme="minorHAnsi" w:hAnsiTheme="minorHAnsi" w:cs="Courier New"/>
-          <w:sz w:val="24"/>
-          <w:szCs w:val="24"/>
-        </w:rPr>
-        <w:t>became</w:t>
-      </w:r>
-      <w:proofErr w:type="gramEnd"/>
-      <w:r>
-        <w:rPr>
-          <w:rFonts w:asciiTheme="minorHAnsi" w:hAnsiTheme="minorHAnsi" w:cs="Courier New"/>
-          <w:sz w:val="24"/>
-          <w:szCs w:val="24"/>
-        </w:rPr>
-        <w:t xml:space="preserve"> </w:t>
+        <w:t xml:space="preserve">I first majored in decision sciences, with Howard Raiffa being my mentor. After two years, I switched over to study general management and strategy. I was reasonably good at the decision sciences material, and that has helped me ever since. But I found the issues of how to structure difficult, unstructured situations more interesting. My mentors became </w:t>
       </w:r>
       <w:r>
         <w:rPr>
@@ -411,15 +391,23 @@
           <w:sz w:val="24"/>
           <w:szCs w:val="24"/>
         </w:rPr>
-        <w:t>to some and, to others</w:t>
-      </w:r>
-      <w:r>
-        <w:rPr>
-          <w:rFonts w:asciiTheme="minorHAnsi" w:hAnsiTheme="minorHAnsi" w:cs="Courier New"/>
-          <w:sz w:val="24"/>
-          <w:szCs w:val="24"/>
-        </w:rPr>
-        <w:t>, a mistake, while to others it broke new ground.</w:t>
+        <w:t>to some</w:t>
+      </w:r>
+      <w:r>
+        <w:rPr>
+          <w:rFonts w:asciiTheme="minorHAnsi" w:hAnsiTheme="minorHAnsi" w:cs="Courier New"/>
+          <w:sz w:val="24"/>
+          <w:szCs w:val="24"/>
+        </w:rPr>
+        <w:t>, a mistake to others, and, to others, a way to break</w:t>
+      </w:r>
+      <w:r>
+        <w:rPr>
+          <w:rFonts w:asciiTheme="minorHAnsi" w:hAnsiTheme="minorHAnsi" w:cs="Courier New"/>
+          <w:sz w:val="24"/>
+          <w:szCs w:val="24"/>
+        </w:rPr>
+        <w:t xml:space="preserve"> new ground.</w:t>
       </w:r>
     </w:p>
     <w:p>
@@ -517,15 +505,7 @@
           <w:sz w:val="24"/>
           <w:szCs w:val="24"/>
         </w:rPr>
-        <w:t xml:space="preserve">Joining UCLA was a bit of a culture shock for a young professor educated at HBS. No one taught cases. They lectured. No one did much executive education. No one did research by visiting companies to see what managers did. On the day I arrived, department chair Barry Richman greeted me by asking, “Did you write anything on the plane?” </w:t>
-      </w:r>
-      <w:r>
-        <w:rPr>
-          <w:rFonts w:asciiTheme="minorHAnsi" w:hAnsiTheme="minorHAnsi" w:cs="Courier New"/>
-          <w:sz w:val="24"/>
-          <w:szCs w:val="24"/>
-        </w:rPr>
-        <w:t xml:space="preserve">The basic drumbeat was to publish papers in academic journals. </w:t>
+        <w:t xml:space="preserve">Joining UCLA was a bit of a culture shock for a young professor educated at HBS. No one taught cases. They lectured. No one did much executive education. No one did research by visiting companies to see what managers did. On the day I arrived, department chair Barry Richman greeted me by asking, “Did you write anything on the plane?” The basic drumbeat was to publish papers in academic journals. </w:t>
       </w:r>
     </w:p>
     <w:p>
@@ -630,61 +610,41 @@
           <w:szCs w:val="24"/>
         </w:rPr>
         <w:lastRenderedPageBreak/>
-        <w:t xml:space="preserve">had started at GE and grown beyond a single company, holding cross-sectional data on the detailed </w:t>
-      </w:r>
-      <w:proofErr w:type="gramStart"/>
-      <w:r>
-        <w:rPr>
-          <w:rFonts w:asciiTheme="minorHAnsi" w:hAnsiTheme="minorHAnsi" w:cs="Courier New"/>
-          <w:sz w:val="24"/>
-          <w:szCs w:val="24"/>
-        </w:rPr>
-        <w:t>financials</w:t>
-      </w:r>
-      <w:proofErr w:type="gramEnd"/>
-      <w:r>
-        <w:rPr>
-          <w:rFonts w:asciiTheme="minorHAnsi" w:hAnsiTheme="minorHAnsi" w:cs="Courier New"/>
-          <w:sz w:val="24"/>
-          <w:szCs w:val="24"/>
-        </w:rPr>
-        <w:t>, industries, and market shares of thousands of business units.)</w:t>
-      </w:r>
-    </w:p>
-    <w:p>
-      <w:pPr>
-        <w:pStyle w:val="PlainText"/>
-        <w:rPr>
-          <w:rFonts w:asciiTheme="minorHAnsi" w:hAnsiTheme="minorHAnsi" w:cs="Courier New"/>
-          <w:sz w:val="24"/>
-          <w:szCs w:val="24"/>
-        </w:rPr>
-      </w:pPr>
-      <w:r>
-        <w:rPr>
-          <w:rFonts w:asciiTheme="minorHAnsi" w:hAnsiTheme="minorHAnsi" w:cs="Courier New"/>
-          <w:sz w:val="24"/>
-          <w:szCs w:val="24"/>
-        </w:rPr>
-        <w:t xml:space="preserve">After visiting the company, I came home with their brochures and a clear understanding of their approach. It had long been established that business profitability was associated with market share. The key SPI product was a complex regression </w:t>
-      </w:r>
-      <w:proofErr w:type="gramStart"/>
-      <w:r>
-        <w:rPr>
-          <w:rFonts w:asciiTheme="minorHAnsi" w:hAnsiTheme="minorHAnsi" w:cs="Courier New"/>
-          <w:sz w:val="24"/>
-          <w:szCs w:val="24"/>
-        </w:rPr>
-        <w:t>model</w:t>
-      </w:r>
-      <w:proofErr w:type="gramEnd"/>
-      <w:r>
-        <w:rPr>
-          <w:rFonts w:asciiTheme="minorHAnsi" w:hAnsiTheme="minorHAnsi" w:cs="Courier New"/>
-          <w:sz w:val="24"/>
-          <w:szCs w:val="24"/>
-        </w:rPr>
-        <w:t xml:space="preserve"> took this even further, predicting return on investment (ROI) based on twenty variables (market share, investment intensity, advertising intensity, price policy, etc.). </w:t>
+        <w:t>had started at GE and grown beyond a single company, holding cross-sectional data on the detailed financials, industries, and market shares of thousands of business units.)</w:t>
+      </w:r>
+    </w:p>
+    <w:p>
+      <w:pPr>
+        <w:pStyle w:val="PlainText"/>
+        <w:rPr>
+          <w:rFonts w:asciiTheme="minorHAnsi" w:hAnsiTheme="minorHAnsi" w:cs="Courier New"/>
+          <w:sz w:val="24"/>
+          <w:szCs w:val="24"/>
+        </w:rPr>
+      </w:pPr>
+      <w:r>
+        <w:rPr>
+          <w:rFonts w:asciiTheme="minorHAnsi" w:hAnsiTheme="minorHAnsi" w:cs="Courier New"/>
+          <w:sz w:val="24"/>
+          <w:szCs w:val="24"/>
+        </w:rPr>
+        <w:t xml:space="preserve">After visiting the company, I came home with their brochures and a clear understanding of their approach. It had long been established that business profitability was associated with market share. The key SPI product was a complex regression model </w:t>
+      </w:r>
+      <w:r>
+        <w:rPr>
+          <w:rFonts w:asciiTheme="minorHAnsi" w:hAnsiTheme="minorHAnsi" w:cs="Courier New"/>
+          <w:sz w:val="24"/>
+          <w:szCs w:val="24"/>
+        </w:rPr>
+        <w:t xml:space="preserve">that </w:t>
+      </w:r>
+      <w:r>
+        <w:rPr>
+          <w:rFonts w:asciiTheme="minorHAnsi" w:hAnsiTheme="minorHAnsi" w:cs="Courier New"/>
+          <w:sz w:val="24"/>
+          <w:szCs w:val="24"/>
+        </w:rPr>
+        <w:t xml:space="preserve">took this even further, predicting return on investment (ROI) based on twenty variables (market share, investment intensity, advertising intensity, price policy, etc.). </w:t>
       </w:r>
       <w:r>
         <w:rPr>
@@ -758,7 +718,7 @@
           <w:sz w:val="24"/>
           <w:szCs w:val="24"/>
         </w:rPr>
-        <w:t xml:space="preserve">If you simply had the input values, you could compute ROI. The regression </w:t>
+        <w:t xml:space="preserve">If you had the input values, you could compute ROI. The regression </w:t>
       </w:r>
       <w:r>
         <w:rPr>
@@ -804,111 +764,107 @@
           <w:sz w:val="24"/>
           <w:szCs w:val="24"/>
         </w:rPr>
-        <w:t xml:space="preserve">In 1979, Robin Wensley, a professor at the University of Warwick in the UK, visited UCLA for a year. His children were enchanted by the LA schools. The coursework was two years behind theirs, and there were skateboarding classes.  Robin and I began a conversation, and then a study of the well-known association between market share and profitability. </w:t>
-      </w:r>
-    </w:p>
-    <w:p>
-      <w:pPr>
-        <w:pStyle w:val="PlainText"/>
-        <w:rPr>
-          <w:rFonts w:asciiTheme="minorHAnsi" w:hAnsiTheme="minorHAnsi" w:cs="Courier New"/>
-          <w:sz w:val="24"/>
-          <w:szCs w:val="24"/>
-        </w:rPr>
-      </w:pPr>
-      <w:r>
-        <w:rPr>
-          <w:rFonts w:asciiTheme="minorHAnsi" w:hAnsiTheme="minorHAnsi" w:cs="Courier New"/>
-          <w:sz w:val="24"/>
-          <w:szCs w:val="24"/>
-        </w:rPr>
-        <w:t xml:space="preserve">I got time-shared access to the SPI PIMs </w:t>
-      </w:r>
-      <w:proofErr w:type="gramStart"/>
-      <w:r>
-        <w:rPr>
-          <w:rFonts w:asciiTheme="minorHAnsi" w:hAnsiTheme="minorHAnsi" w:cs="Courier New"/>
-          <w:sz w:val="24"/>
-          <w:szCs w:val="24"/>
-        </w:rPr>
-        <w:t>data</w:t>
-      </w:r>
-      <w:proofErr w:type="gramEnd"/>
-      <w:r>
-        <w:rPr>
-          <w:rFonts w:asciiTheme="minorHAnsi" w:hAnsiTheme="minorHAnsi" w:cs="Courier New"/>
-          <w:sz w:val="24"/>
-          <w:szCs w:val="24"/>
-        </w:rPr>
-        <w:t xml:space="preserve"> and we began to explore the relationship. The effect was certainly there---the simple correlation between share and return was about 0.3. Robin wanted to know about the cost of gaining market share. </w:t>
-      </w:r>
-      <w:proofErr w:type="gramStart"/>
-      <w:r>
-        <w:rPr>
-          <w:rFonts w:asciiTheme="minorHAnsi" w:hAnsiTheme="minorHAnsi" w:cs="Courier New"/>
-          <w:sz w:val="24"/>
-          <w:szCs w:val="24"/>
-        </w:rPr>
-        <w:t>So</w:t>
-      </w:r>
-      <w:proofErr w:type="gramEnd"/>
-      <w:r>
-        <w:rPr>
-          <w:rFonts w:asciiTheme="minorHAnsi" w:hAnsiTheme="minorHAnsi" w:cs="Courier New"/>
-          <w:sz w:val="24"/>
-          <w:szCs w:val="24"/>
-        </w:rPr>
-        <w:t xml:space="preserve"> we built a regression estimating the impact on return of the price changes, marketing expenses, and construction costs of increasing market share. The surprising result was that they had no statistical impact on changes in market share. Increased market share was free!</w:t>
-      </w:r>
-    </w:p>
-    <w:p>
-      <w:pPr>
-        <w:pStyle w:val="PlainText"/>
-        <w:rPr>
-          <w:rFonts w:asciiTheme="minorHAnsi" w:hAnsiTheme="minorHAnsi" w:cs="Courier New"/>
-          <w:sz w:val="24"/>
-          <w:szCs w:val="24"/>
-        </w:rPr>
-      </w:pPr>
-      <w:r>
-        <w:rPr>
-          <w:rFonts w:asciiTheme="minorHAnsi" w:hAnsiTheme="minorHAnsi" w:cs="Courier New"/>
-          <w:sz w:val="24"/>
-          <w:szCs w:val="24"/>
-        </w:rPr>
-        <w:t xml:space="preserve">Then, almost overnight, it dawned on us that the changes in profit and market share were both being driven by stuff that wasn’t in the accounting data. The driving forces were luck, good management, </w:t>
-      </w:r>
-      <w:r>
-        <w:rPr>
-          <w:rFonts w:asciiTheme="minorHAnsi" w:hAnsiTheme="minorHAnsi" w:cs="Courier New"/>
-          <w:sz w:val="24"/>
-          <w:szCs w:val="24"/>
-        </w:rPr>
-        <w:t xml:space="preserve">clever product innovation, or </w:t>
-      </w:r>
-      <w:r>
-        <w:rPr>
-          <w:rFonts w:asciiTheme="minorHAnsi" w:hAnsiTheme="minorHAnsi" w:cs="Courier New"/>
-          <w:sz w:val="24"/>
-          <w:szCs w:val="24"/>
-        </w:rPr>
-        <w:t>smart</w:t>
-      </w:r>
-      <w:r>
-        <w:rPr>
-          <w:rFonts w:asciiTheme="minorHAnsi" w:hAnsiTheme="minorHAnsi" w:cs="Courier New"/>
-          <w:sz w:val="24"/>
-          <w:szCs w:val="24"/>
-        </w:rPr>
-        <w:t xml:space="preserve"> marketing. </w:t>
-      </w:r>
-      <w:r>
-        <w:rPr>
-          <w:rFonts w:asciiTheme="minorHAnsi" w:hAnsiTheme="minorHAnsi" w:cs="Courier New"/>
-          <w:sz w:val="24"/>
-          <w:szCs w:val="24"/>
-        </w:rPr>
-        <w:t>Our paper, “Market Share and Business Profitability: Testing the Stochastic Hypothesis,” was presented at the 1981 Academy of Management Meeting.</w:t>
+        <w:t xml:space="preserve">In 1979, Robin Wensley, a professor at the University of Warwick in the UK, visited UCLA for a year. </w:t>
+      </w:r>
+      <w:r>
+        <w:rPr>
+          <w:rFonts w:asciiTheme="minorHAnsi" w:hAnsiTheme="minorHAnsi" w:cs="Courier New"/>
+          <w:sz w:val="24"/>
+          <w:szCs w:val="24"/>
+        </w:rPr>
+        <w:t>The LA schools enchanted his children</w:t>
+      </w:r>
+      <w:r>
+        <w:rPr>
+          <w:rFonts w:asciiTheme="minorHAnsi" w:hAnsiTheme="minorHAnsi" w:cs="Courier New"/>
+          <w:sz w:val="24"/>
+          <w:szCs w:val="24"/>
+        </w:rPr>
+        <w:t xml:space="preserve">. The coursework was two years behind theirs, and there were skateboarding classes.  Robin and I began a conversation, and then a study of the well-known association between market share and profitability. </w:t>
+      </w:r>
+    </w:p>
+    <w:p>
+      <w:pPr>
+        <w:pStyle w:val="PlainText"/>
+        <w:rPr>
+          <w:rFonts w:asciiTheme="minorHAnsi" w:hAnsiTheme="minorHAnsi" w:cs="Courier New"/>
+          <w:sz w:val="24"/>
+          <w:szCs w:val="24"/>
+        </w:rPr>
+      </w:pPr>
+      <w:r>
+        <w:rPr>
+          <w:rFonts w:asciiTheme="minorHAnsi" w:hAnsiTheme="minorHAnsi" w:cs="Courier New"/>
+          <w:sz w:val="24"/>
+          <w:szCs w:val="24"/>
+        </w:rPr>
+        <w:t>I got time-shared access to the SPI PIMs data</w:t>
+      </w:r>
+      <w:r>
+        <w:rPr>
+          <w:rFonts w:asciiTheme="minorHAnsi" w:hAnsiTheme="minorHAnsi" w:cs="Courier New"/>
+          <w:sz w:val="24"/>
+          <w:szCs w:val="24"/>
+        </w:rPr>
+        <w:t>, and we began exploring</w:t>
+      </w:r>
+      <w:r>
+        <w:rPr>
+          <w:rFonts w:asciiTheme="minorHAnsi" w:hAnsiTheme="minorHAnsi" w:cs="Courier New"/>
+          <w:sz w:val="24"/>
+          <w:szCs w:val="24"/>
+        </w:rPr>
+        <w:t xml:space="preserve"> the relationship. The effect was certainly there</w:t>
+      </w:r>
+      <w:r>
+        <w:rPr>
+          <w:rFonts w:asciiTheme="minorHAnsi" w:hAnsiTheme="minorHAnsi" w:cs="Courier New"/>
+          <w:sz w:val="24"/>
+          <w:szCs w:val="24"/>
+        </w:rPr>
+        <w:t xml:space="preserve"> — </w:t>
+      </w:r>
+      <w:r>
+        <w:rPr>
+          <w:rFonts w:asciiTheme="minorHAnsi" w:hAnsiTheme="minorHAnsi" w:cs="Courier New"/>
+          <w:sz w:val="24"/>
+          <w:szCs w:val="24"/>
+        </w:rPr>
+        <w:t xml:space="preserve">the simple correlation between share and return was about 0.3. Robin wanted to know about the cost of gaining market share. So we built a regression </w:t>
+      </w:r>
+      <w:r>
+        <w:rPr>
+          <w:rFonts w:asciiTheme="minorHAnsi" w:hAnsiTheme="minorHAnsi" w:cs="Courier New"/>
+          <w:sz w:val="24"/>
+          <w:szCs w:val="24"/>
+        </w:rPr>
+        <w:t>to estimate the impact on returns of price changes, marketing expenses, and construction costs associated with</w:t>
+      </w:r>
+      <w:r>
+        <w:rPr>
+          <w:rFonts w:asciiTheme="minorHAnsi" w:hAnsiTheme="minorHAnsi" w:cs="Courier New"/>
+          <w:sz w:val="24"/>
+          <w:szCs w:val="24"/>
+        </w:rPr>
+        <w:t xml:space="preserve"> increasing market share. The surprising result was that they had no statistical impact on changes in market share. Increased market share was free!</w:t>
+      </w:r>
+    </w:p>
+    <w:p>
+      <w:pPr>
+        <w:pStyle w:val="PlainText"/>
+        <w:rPr>
+          <w:rFonts w:asciiTheme="minorHAnsi" w:hAnsiTheme="minorHAnsi" w:cs="Courier New"/>
+          <w:sz w:val="24"/>
+          <w:szCs w:val="24"/>
+        </w:rPr>
+      </w:pPr>
+      <w:r>
+        <w:rPr>
+          <w:rFonts w:asciiTheme="minorHAnsi" w:hAnsiTheme="minorHAnsi" w:cs="Courier New"/>
+          <w:sz w:val="24"/>
+          <w:szCs w:val="24"/>
+        </w:rPr>
+        <w:t>Then, almost overnight, it dawned on us that the changes in profit and market share were both being driven by stuff that wasn’t in the accounting data. The driving forces were luck, good management, clever product innovation, or smart marketing. Our paper, “Market Share and Business Profitability: Testing the Stochastic Hypothesis,” was presented at the 1981 Academy of Management Meeting.</w:t>
       </w:r>
     </w:p>
     <w:p>
@@ -936,16 +892,14 @@
         </w:rPr>
         <w:t xml:space="preserve"> this was </w:t>
       </w:r>
-      <w:proofErr w:type="gramStart"/>
-      <w:r>
-        <w:rPr>
-          <w:rFonts w:asciiTheme="minorHAnsi" w:hAnsiTheme="minorHAnsi" w:cs="Courier New"/>
-          <w:sz w:val="24"/>
-          <w:szCs w:val="24"/>
-        </w:rPr>
-        <w:t>a first</w:t>
-      </w:r>
-      <w:proofErr w:type="gramEnd"/>
+      <w:r>
+        <w:rPr>
+          <w:rFonts w:asciiTheme="minorHAnsi" w:hAnsiTheme="minorHAnsi" w:cs="Courier New"/>
+          <w:sz w:val="24"/>
+          <w:szCs w:val="24"/>
+        </w:rPr>
+        <w:t>the first</w:t>
+      </w:r>
       <w:r>
         <w:rPr>
           <w:rFonts w:asciiTheme="minorHAnsi" w:hAnsiTheme="minorHAnsi" w:cs="Courier New"/>
@@ -1010,38 +964,171 @@
           <w:sz w:val="24"/>
           <w:szCs w:val="24"/>
         </w:rPr>
+        <w:t xml:space="preserve">At about that time, the UCLA management and organizations group had an off-site conference. We invited Stiglitz and Armen </w:t>
+      </w:r>
+      <w:proofErr w:type="spellStart"/>
+      <w:r>
+        <w:rPr>
+          <w:rFonts w:asciiTheme="minorHAnsi" w:hAnsiTheme="minorHAnsi" w:cs="Courier New"/>
+          <w:sz w:val="24"/>
+          <w:szCs w:val="24"/>
+        </w:rPr>
+        <w:t>Alchian</w:t>
+      </w:r>
+      <w:proofErr w:type="spellEnd"/>
+      <w:r>
+        <w:rPr>
+          <w:rFonts w:asciiTheme="minorHAnsi" w:hAnsiTheme="minorHAnsi" w:cs="Courier New"/>
+          <w:sz w:val="24"/>
+          <w:szCs w:val="24"/>
+        </w:rPr>
+        <w:t xml:space="preserve">, both noted economists. I recall Stiglitz and me drinking beer and talking about the dinosaurs' extinction. “If the dinosaurs could have borrowed in capital markets for genomes,” Stiglitz wondered, “would they have gone extinct?” I thought not. </w:t>
+      </w:r>
+    </w:p>
+    <w:p>
+      <w:pPr>
+        <w:pStyle w:val="PlainText"/>
+        <w:rPr>
+          <w:rFonts w:asciiTheme="minorHAnsi" w:hAnsiTheme="minorHAnsi" w:cs="Courier New"/>
+          <w:sz w:val="24"/>
+          <w:szCs w:val="24"/>
+        </w:rPr>
+      </w:pPr>
+      <w:r>
+        <w:rPr>
+          <w:rFonts w:asciiTheme="minorHAnsi" w:hAnsiTheme="minorHAnsi" w:cs="Courier New"/>
+          <w:sz w:val="24"/>
+          <w:szCs w:val="24"/>
+        </w:rPr>
+        <w:lastRenderedPageBreak/>
+        <w:t xml:space="preserve">At the same conference, I gave a talk about the future of strategy studies. In the audience, Armen </w:t>
+      </w:r>
+      <w:proofErr w:type="spellStart"/>
+      <w:r>
+        <w:rPr>
+          <w:rFonts w:asciiTheme="minorHAnsi" w:hAnsiTheme="minorHAnsi" w:cs="Courier New"/>
+          <w:sz w:val="24"/>
+          <w:szCs w:val="24"/>
+        </w:rPr>
+        <w:t>Alchain</w:t>
+      </w:r>
+      <w:proofErr w:type="spellEnd"/>
+      <w:r>
+        <w:rPr>
+          <w:rFonts w:asciiTheme="minorHAnsi" w:hAnsiTheme="minorHAnsi" w:cs="Courier New"/>
+          <w:sz w:val="24"/>
+          <w:szCs w:val="24"/>
+        </w:rPr>
+        <w:t xml:space="preserve"> had a question. “What is the strategy subject?” </w:t>
+      </w:r>
+    </w:p>
+    <w:p>
+      <w:pPr>
+        <w:pStyle w:val="PlainText"/>
+        <w:rPr>
+          <w:rFonts w:asciiTheme="minorHAnsi" w:hAnsiTheme="minorHAnsi" w:cs="Courier New"/>
+          <w:sz w:val="24"/>
+          <w:szCs w:val="24"/>
+        </w:rPr>
+      </w:pPr>
+      <w:r>
+        <w:rPr>
+          <w:rFonts w:asciiTheme="minorHAnsi" w:hAnsiTheme="minorHAnsi" w:cs="Courier New"/>
+          <w:sz w:val="24"/>
+          <w:szCs w:val="24"/>
+        </w:rPr>
+        <w:t xml:space="preserve">I stuttered a bit. I said it was the study of general management in the direction of enterprises. </w:t>
+      </w:r>
+    </w:p>
+    <w:p>
+      <w:pPr>
+        <w:pStyle w:val="PlainText"/>
+        <w:rPr>
+          <w:rFonts w:asciiTheme="minorHAnsi" w:hAnsiTheme="minorHAnsi" w:cs="Courier New"/>
+          <w:sz w:val="24"/>
+          <w:szCs w:val="24"/>
+        </w:rPr>
+      </w:pPr>
+      <w:r>
+        <w:rPr>
+          <w:rFonts w:asciiTheme="minorHAnsi" w:hAnsiTheme="minorHAnsi" w:cs="Courier New"/>
+          <w:sz w:val="24"/>
+          <w:szCs w:val="24"/>
+        </w:rPr>
+        <w:t>“Do you have any propositions?” he queried.</w:t>
+      </w:r>
+    </w:p>
+    <w:p>
+      <w:pPr>
+        <w:pStyle w:val="PlainText"/>
+        <w:rPr>
+          <w:rFonts w:asciiTheme="minorHAnsi" w:hAnsiTheme="minorHAnsi" w:cs="Courier New"/>
+          <w:sz w:val="24"/>
+          <w:szCs w:val="24"/>
+        </w:rPr>
+      </w:pPr>
+      <w:r>
+        <w:rPr>
+          <w:rFonts w:asciiTheme="minorHAnsi" w:hAnsiTheme="minorHAnsi" w:cs="Courier New"/>
+          <w:sz w:val="24"/>
+          <w:szCs w:val="24"/>
+        </w:rPr>
+        <w:t xml:space="preserve">I did not know how to respond. Our field did not work like economics, trying to reason out behavior from first principles, in imitation of physics. I could do physics, even some general relativity, and I knew that economics was a hodgepodge compared to a real science. But </w:t>
+      </w:r>
+      <w:proofErr w:type="spellStart"/>
+      <w:r>
+        <w:rPr>
+          <w:rFonts w:asciiTheme="minorHAnsi" w:hAnsiTheme="minorHAnsi" w:cs="Courier New"/>
+          <w:sz w:val="24"/>
+          <w:szCs w:val="24"/>
+        </w:rPr>
+        <w:t>Alchain</w:t>
+      </w:r>
+      <w:proofErr w:type="spellEnd"/>
+      <w:r>
+        <w:rPr>
+          <w:rFonts w:asciiTheme="minorHAnsi" w:hAnsiTheme="minorHAnsi" w:cs="Courier New"/>
+          <w:sz w:val="24"/>
+          <w:szCs w:val="24"/>
+        </w:rPr>
+        <w:t xml:space="preserve"> was a senior professor and deservedly famous pioneer in property rights and the theory of the firm. I did not know what to say.</w:t>
+      </w:r>
+    </w:p>
+    <w:p>
+      <w:pPr>
+        <w:pStyle w:val="PlainText"/>
+        <w:rPr>
+          <w:rFonts w:asciiTheme="minorHAnsi" w:hAnsiTheme="minorHAnsi" w:cs="Courier New"/>
+          <w:sz w:val="24"/>
+          <w:szCs w:val="24"/>
+        </w:rPr>
+      </w:pPr>
+      <w:r>
+        <w:rPr>
+          <w:rFonts w:asciiTheme="minorHAnsi" w:hAnsiTheme="minorHAnsi" w:cs="Courier New"/>
+          <w:sz w:val="24"/>
+          <w:szCs w:val="24"/>
+        </w:rPr>
+        <w:t>It took me several weeks to shake off my anger and dejection at this embarrassment. When my mind cleared, I realized that I did have a proposition for him. It was simple. It was that firms were different. They were not the firms of economics, all the same within an industry, but for scale. Firms had “strategies” that were combinations of key resources and policies, making them far from the homogeneous firms in economics.</w:t>
+      </w:r>
+    </w:p>
+    <w:p>
+      <w:pPr>
+        <w:pStyle w:val="PlainText"/>
+        <w:rPr>
+          <w:rFonts w:asciiTheme="minorHAnsi" w:hAnsiTheme="minorHAnsi" w:cs="Courier New"/>
+          <w:sz w:val="24"/>
+          <w:szCs w:val="24"/>
+        </w:rPr>
+      </w:pPr>
+      <w:r>
+        <w:rPr>
+          <w:rFonts w:asciiTheme="minorHAnsi" w:hAnsiTheme="minorHAnsi" w:cs="Courier New"/>
+          <w:sz w:val="24"/>
+          <w:szCs w:val="24"/>
+        </w:rPr>
         <w:t>Trying to learn more about economics, I started to read the Bell Journal. Among economic journals, it seemed to have a more practical orientation. Looking at an article in the Spring 1977 issue on coal industry economics, I stared at the Figure 2 illustration of cost curves:</w:t>
       </w:r>
-    </w:p>
-    <w:p>
-      <w:pPr>
-        <w:pStyle w:val="PlainText"/>
-        <w:rPr>
-          <w:rFonts w:asciiTheme="minorHAnsi" w:hAnsiTheme="minorHAnsi" w:cs="Courier New"/>
-          <w:sz w:val="24"/>
-          <w:szCs w:val="24"/>
-        </w:rPr>
-      </w:pPr>
-    </w:p>
-    <w:p>
-      <w:pPr>
-        <w:pStyle w:val="PlainText"/>
-        <w:rPr>
-          <w:rFonts w:asciiTheme="minorHAnsi" w:hAnsiTheme="minorHAnsi" w:cs="Courier New"/>
-          <w:sz w:val="24"/>
-          <w:szCs w:val="24"/>
-        </w:rPr>
-      </w:pPr>
-    </w:p>
-    <w:p>
-      <w:pPr>
-        <w:pStyle w:val="PlainText"/>
-        <w:rPr>
-          <w:rFonts w:asciiTheme="minorHAnsi" w:hAnsiTheme="minorHAnsi" w:cs="Courier New"/>
-          <w:sz w:val="24"/>
-          <w:szCs w:val="24"/>
-        </w:rPr>
-      </w:pPr>
     </w:p>
     <w:p>
       <w:pPr>
@@ -1069,7 +1156,7 @@
           <w14:ligatures w14:val="standardContextual"/>
         </w:rPr>
         <w:drawing>
-          <wp:inline distT="0" distB="0" distL="0" distR="0" wp14:anchorId="37B891CB" wp14:editId="22E25004">
+          <wp:inline distT="0" distB="0" distL="0" distR="0" wp14:anchorId="3152A898" wp14:editId="4B1AA2EA">
             <wp:extent cx="3438144" cy="3611880"/>
             <wp:effectExtent l="0" t="0" r="0" b="7620"/>
             <wp:docPr id="958543927" name="Picture 1" descr="The image illustrates a graph depicting the relationship between average cost and the output, with AC representing the average cost, and the graph includes points for AC at different levels of output.&#10;&#10;AI-generated content may be incorrect."/>
@@ -1118,35 +1205,67 @@
     <w:p>
       <w:pPr>
         <w:pStyle w:val="PlainText"/>
-        <w:rPr>
-          <w:rFonts w:asciiTheme="minorHAnsi" w:hAnsiTheme="minorHAnsi" w:cs="Courier New"/>
-          <w:sz w:val="24"/>
-          <w:szCs w:val="24"/>
-        </w:rPr>
-      </w:pPr>
-      <w:r>
-        <w:rPr>
-          <w:rFonts w:asciiTheme="minorHAnsi" w:hAnsiTheme="minorHAnsi" w:cs="Courier New"/>
-          <w:sz w:val="24"/>
-          <w:szCs w:val="24"/>
-        </w:rPr>
-        <w:t xml:space="preserve">It showed the standard u-shaped </w:t>
-      </w:r>
-      <w:r>
-        <w:rPr>
-          <w:rFonts w:asciiTheme="minorHAnsi" w:hAnsiTheme="minorHAnsi" w:cs="Courier New"/>
-          <w:sz w:val="24"/>
-          <w:szCs w:val="24"/>
-        </w:rPr>
-        <w:t xml:space="preserve">average </w:t>
-      </w:r>
-      <w:r>
-        <w:rPr>
-          <w:rFonts w:asciiTheme="minorHAnsi" w:hAnsiTheme="minorHAnsi" w:cs="Courier New"/>
-          <w:sz w:val="24"/>
-          <w:szCs w:val="24"/>
-        </w:rPr>
-        <w:t>cost curves for coal mines with differing seam widths of the coal. Wider seams gave less costly coa</w:t>
+        <w:jc w:val="center"/>
+        <w:rPr>
+          <w:rFonts w:asciiTheme="minorHAnsi" w:hAnsiTheme="minorHAnsi" w:cs="Courier New"/>
+          <w:sz w:val="24"/>
+          <w:szCs w:val="24"/>
+        </w:rPr>
+      </w:pPr>
+    </w:p>
+    <w:p>
+      <w:pPr>
+        <w:pStyle w:val="PlainText"/>
+        <w:jc w:val="center"/>
+        <w:rPr>
+          <w:rFonts w:asciiTheme="minorHAnsi" w:hAnsiTheme="minorHAnsi" w:cs="Courier New"/>
+          <w:sz w:val="24"/>
+          <w:szCs w:val="24"/>
+        </w:rPr>
+      </w:pPr>
+    </w:p>
+    <w:p>
+      <w:pPr>
+        <w:pStyle w:val="PlainText"/>
+        <w:rPr>
+          <w:rFonts w:asciiTheme="minorHAnsi" w:hAnsiTheme="minorHAnsi" w:cs="Courier New"/>
+          <w:sz w:val="24"/>
+          <w:szCs w:val="24"/>
+        </w:rPr>
+      </w:pPr>
+    </w:p>
+    <w:p>
+      <w:pPr>
+        <w:pStyle w:val="PlainText"/>
+        <w:rPr>
+          <w:rFonts w:asciiTheme="minorHAnsi" w:hAnsiTheme="minorHAnsi" w:cs="Courier New"/>
+          <w:sz w:val="24"/>
+          <w:szCs w:val="24"/>
+        </w:rPr>
+      </w:pPr>
+      <w:r>
+        <w:rPr>
+          <w:rFonts w:asciiTheme="minorHAnsi" w:hAnsiTheme="minorHAnsi" w:cs="Courier New"/>
+          <w:sz w:val="24"/>
+          <w:szCs w:val="24"/>
+        </w:rPr>
+        <w:t xml:space="preserve">It showed the standard </w:t>
+      </w:r>
+      <w:r>
+        <w:rPr>
+          <w:rFonts w:asciiTheme="minorHAnsi" w:hAnsiTheme="minorHAnsi" w:cs="Courier New"/>
+          <w:sz w:val="24"/>
+          <w:szCs w:val="24"/>
+        </w:rPr>
+        <w:t>U-shaped average cost curves for coal mines with varying seam widths</w:t>
+      </w:r>
+      <w:r>
+        <w:rPr>
+          <w:rFonts w:asciiTheme="minorHAnsi" w:hAnsiTheme="minorHAnsi" w:cs="Courier New"/>
+          <w:sz w:val="24"/>
+          <w:szCs w:val="24"/>
+        </w:rPr>
+        <w:t>. Wider seams gave less costly coa</w:t>
       </w:r>
       <w:r>
         <w:rPr>
@@ -1178,25 +1297,7 @@
           <w:sz w:val="24"/>
           <w:szCs w:val="24"/>
         </w:rPr>
-        <w:t>work with Robin on market share was still in my head. “</w:t>
-      </w:r>
-      <w:proofErr w:type="gramStart"/>
-      <w:r>
-        <w:rPr>
-          <w:rFonts w:asciiTheme="minorHAnsi" w:hAnsiTheme="minorHAnsi" w:cs="Courier New"/>
-          <w:sz w:val="24"/>
-          <w:szCs w:val="24"/>
-        </w:rPr>
-        <w:t>But,</w:t>
-      </w:r>
-      <w:proofErr w:type="gramEnd"/>
-      <w:r>
-        <w:rPr>
-          <w:rFonts w:asciiTheme="minorHAnsi" w:hAnsiTheme="minorHAnsi" w:cs="Courier New"/>
-          <w:sz w:val="24"/>
-          <w:szCs w:val="24"/>
-        </w:rPr>
-        <w:t xml:space="preserve">” I thought, “one does not know the width of the seam until you invest and dig.” </w:t>
+        <w:t xml:space="preserve">work with Robin on market share was still in my head. “But,” I thought, “one does not know the width of the seam until you invest and dig.” </w:t>
       </w:r>
     </w:p>
     <w:p>
@@ -1232,7 +1333,23 @@
           <w:sz w:val="24"/>
           <w:szCs w:val="24"/>
         </w:rPr>
-        <w:t>An adept modeler, he gave me a critical lesson. “You have to strip out everything but the essential elements.” The next day he suggested a model he called “musical chairs.” There are only N slots for firms in the industry. When a new firm enters, it draws its cost C randomly from a distribution. If it beats a firm already sitting in one of the N chairs, it takes its place.</w:t>
+        <w:t>An adept modeler, he gave me a critical lesson. “You have to strip out everything but the essential elements.” The next day</w:t>
+      </w:r>
+      <w:r>
+        <w:rPr>
+          <w:rFonts w:asciiTheme="minorHAnsi" w:hAnsiTheme="minorHAnsi" w:cs="Courier New"/>
+          <w:sz w:val="24"/>
+          <w:szCs w:val="24"/>
+        </w:rPr>
+        <w:t>,</w:t>
+      </w:r>
+      <w:r>
+        <w:rPr>
+          <w:rFonts w:asciiTheme="minorHAnsi" w:hAnsiTheme="minorHAnsi" w:cs="Courier New"/>
+          <w:sz w:val="24"/>
+          <w:szCs w:val="24"/>
+        </w:rPr>
+        <w:t xml:space="preserve"> he suggested a model he called “musical chairs.” There are only N slots for firms in the industry. When a new firm enters, it draws its cost C randomly from a distribution. If it beats a firm already sitting in one of the N chairs, it takes its place.</w:t>
       </w:r>
       <w:r>
         <w:rPr>
@@ -1248,7 +1365,23 @@
           <w:sz w:val="24"/>
           <w:szCs w:val="24"/>
         </w:rPr>
-        <w:t xml:space="preserve">We both worked the math on that model together. </w:t>
+        <w:t xml:space="preserve">We both worked </w:t>
+      </w:r>
+      <w:r>
+        <w:rPr>
+          <w:rFonts w:asciiTheme="minorHAnsi" w:hAnsiTheme="minorHAnsi" w:cs="Courier New"/>
+          <w:sz w:val="24"/>
+          <w:szCs w:val="24"/>
+        </w:rPr>
+        <w:t>through the math on that model</w:t>
+      </w:r>
+      <w:r>
+        <w:rPr>
+          <w:rFonts w:asciiTheme="minorHAnsi" w:hAnsiTheme="minorHAnsi" w:cs="Courier New"/>
+          <w:sz w:val="24"/>
+          <w:szCs w:val="24"/>
+        </w:rPr>
+        <w:t xml:space="preserve">. </w:t>
       </w:r>
     </w:p>
     <w:p>
@@ -1274,16 +1407,7 @@
           <w:sz w:val="24"/>
           <w:szCs w:val="24"/>
         </w:rPr>
-        <w:t xml:space="preserve">Uncertain </w:t>
-      </w:r>
-      <w:r>
-        <w:rPr>
-          <w:rFonts w:asciiTheme="minorHAnsi" w:hAnsiTheme="minorHAnsi" w:cs="Courier New"/>
-          <w:sz w:val="24"/>
-          <w:szCs w:val="24"/>
-        </w:rPr>
-        <w:lastRenderedPageBreak/>
-        <w:t xml:space="preserve">imitability keeps competition from </w:t>
+        <w:t xml:space="preserve">Uncertain imitability keeps competition from </w:t>
       </w:r>
       <w:r>
         <w:rPr>
@@ -1383,6 +1507,14 @@
           <w:sz w:val="24"/>
           <w:szCs w:val="24"/>
         </w:rPr>
+        <w:t xml:space="preserve">Uncertain imitability was my answer to Alchian’s question. </w:t>
+      </w:r>
+      <w:r>
+        <w:rPr>
+          <w:rFonts w:asciiTheme="minorHAnsi" w:hAnsiTheme="minorHAnsi" w:cs="Courier New"/>
+          <w:sz w:val="24"/>
+          <w:szCs w:val="24"/>
+        </w:rPr>
         <w:t>Getting tenure at UCLA was not a done deal. But this paper pushed me over the top. Some important economists apparently liked it a lot.</w:t>
       </w:r>
     </w:p>
@@ -1395,6 +1527,1545 @@
           <w:szCs w:val="24"/>
         </w:rPr>
       </w:pPr>
+      <w:r>
+        <w:rPr>
+          <w:rFonts w:asciiTheme="minorHAnsi" w:hAnsiTheme="minorHAnsi" w:cs="Courier New"/>
+          <w:sz w:val="24"/>
+          <w:szCs w:val="24"/>
+        </w:rPr>
+        <w:t xml:space="preserve">At the 1987 meeting of the </w:t>
+      </w:r>
+      <w:r>
+        <w:rPr>
+          <w:rFonts w:asciiTheme="minorHAnsi" w:hAnsiTheme="minorHAnsi" w:cs="Courier New"/>
+          <w:sz w:val="24"/>
+          <w:szCs w:val="24"/>
+        </w:rPr>
+        <w:t xml:space="preserve">Strategic Management Society </w:t>
+      </w:r>
+      <w:r>
+        <w:rPr>
+          <w:rFonts w:asciiTheme="minorHAnsi" w:hAnsiTheme="minorHAnsi" w:cs="Courier New"/>
+          <w:sz w:val="24"/>
+          <w:szCs w:val="24"/>
+        </w:rPr>
+        <w:t>(Boston), I spent some time with Dan Schendel talking about the future of strategy studies. I was convinced that we had to spread out and reach scholars in related fields like economics, sociology, military affairs, history, and psychology. We needed that kind of brain power and looking at the difficult question of policy formulation in the real world.</w:t>
+      </w:r>
+    </w:p>
+    <w:p>
+      <w:pPr>
+        <w:pStyle w:val="PlainText"/>
+        <w:rPr>
+          <w:rFonts w:asciiTheme="minorHAnsi" w:hAnsiTheme="minorHAnsi" w:cs="Courier New"/>
+          <w:sz w:val="24"/>
+          <w:szCs w:val="24"/>
+        </w:rPr>
+      </w:pPr>
+      <w:r>
+        <w:rPr>
+          <w:rFonts w:asciiTheme="minorHAnsi" w:hAnsiTheme="minorHAnsi" w:cs="Courier New"/>
+          <w:sz w:val="24"/>
+          <w:szCs w:val="24"/>
+        </w:rPr>
+        <w:t xml:space="preserve">With the interest of David Teece (UC Berkeley), and his access to financial support, the idea of a just such a conference aimed at broadening the field took shape. </w:t>
+      </w:r>
+    </w:p>
+    <w:p>
+      <w:pPr>
+        <w:pStyle w:val="PlainText"/>
+        <w:rPr>
+          <w:rFonts w:asciiTheme="minorHAnsi" w:hAnsiTheme="minorHAnsi" w:cs="Courier New"/>
+          <w:sz w:val="24"/>
+          <w:szCs w:val="24"/>
+        </w:rPr>
+      </w:pPr>
+    </w:p>
+    <w:tbl>
+      <w:tblPr>
+        <w:tblW w:w="16537" w:type="dxa"/>
+        <w:tblLook w:val="04A0" w:firstRow="1" w:lastRow="0" w:firstColumn="1" w:lastColumn="0" w:noHBand="0" w:noVBand="1"/>
+      </w:tblPr>
+      <w:tblGrid>
+        <w:gridCol w:w="10900"/>
+        <w:gridCol w:w="4677"/>
+        <w:gridCol w:w="960"/>
+      </w:tblGrid>
+      <w:tr>
+        <w:trPr>
+          <w:trHeight w:val="300"/>
+        </w:trPr>
+        <w:tc>
+          <w:tcPr>
+            <w:tcW w:w="10900" w:type="dxa"/>
+            <w:tcBorders>
+              <w:top w:val="nil"/>
+              <w:left w:val="nil"/>
+              <w:bottom w:val="nil"/>
+              <w:right w:val="nil"/>
+            </w:tcBorders>
+            <w:noWrap/>
+            <w:vAlign w:val="bottom"/>
+            <w:hideMark/>
+          </w:tcPr>
+          <w:p>
+            <w:pPr>
+              <w:spacing w:before="0" w:after="0" w:line="240" w:lineRule="auto"/>
+              <w:rPr>
+                <w:rFonts w:ascii="Aptos Narrow" w:eastAsia="Times New Roman" w:hAnsi="Aptos Narrow" w:cs="Times New Roman"/>
+                <w:color w:val="000000"/>
+              </w:rPr>
+            </w:pPr>
+            <w:r>
+              <w:rPr>
+                <w:rFonts w:ascii="Aptos Narrow" w:eastAsia="Times New Roman" w:hAnsi="Aptos Narrow" w:cs="Times New Roman"/>
+                <w:color w:val="000000"/>
+              </w:rPr>
+              <w:t>Uncertain Imitability: An Analysis of Interfirm Differences in Efficiency Under Competition</w:t>
+            </w:r>
+          </w:p>
+        </w:tc>
+        <w:tc>
+          <w:tcPr>
+            <w:tcW w:w="4677" w:type="dxa"/>
+            <w:tcBorders>
+              <w:top w:val="nil"/>
+              <w:left w:val="nil"/>
+              <w:bottom w:val="nil"/>
+              <w:right w:val="nil"/>
+            </w:tcBorders>
+            <w:noWrap/>
+            <w:vAlign w:val="bottom"/>
+            <w:hideMark/>
+          </w:tcPr>
+          <w:p>
+            <w:pPr>
+              <w:spacing w:before="0" w:after="0" w:line="240" w:lineRule="auto"/>
+              <w:rPr>
+                <w:rFonts w:ascii="Aptos Narrow" w:eastAsia="Times New Roman" w:hAnsi="Aptos Narrow" w:cs="Times New Roman"/>
+                <w:color w:val="000000"/>
+              </w:rPr>
+            </w:pPr>
+            <w:r>
+              <w:rPr>
+                <w:rFonts w:ascii="Aptos Narrow" w:eastAsia="Times New Roman" w:hAnsi="Aptos Narrow" w:cs="Times New Roman"/>
+                <w:color w:val="000000"/>
+              </w:rPr>
+              <w:t>Steven A. Lippman &amp; Richard P. Rumelt</w:t>
+            </w:r>
+          </w:p>
+        </w:tc>
+        <w:tc>
+          <w:tcPr>
+            <w:tcW w:w="960" w:type="dxa"/>
+            <w:tcBorders>
+              <w:top w:val="nil"/>
+              <w:left w:val="nil"/>
+              <w:bottom w:val="nil"/>
+              <w:right w:val="nil"/>
+            </w:tcBorders>
+            <w:noWrap/>
+            <w:vAlign w:val="bottom"/>
+            <w:hideMark/>
+          </w:tcPr>
+          <w:p>
+            <w:pPr>
+              <w:spacing w:before="0" w:after="0" w:line="240" w:lineRule="auto"/>
+              <w:jc w:val="right"/>
+              <w:rPr>
+                <w:rFonts w:ascii="Aptos Narrow" w:eastAsia="Times New Roman" w:hAnsi="Aptos Narrow" w:cs="Times New Roman"/>
+                <w:color w:val="000000"/>
+              </w:rPr>
+            </w:pPr>
+            <w:r>
+              <w:rPr>
+                <w:rFonts w:ascii="Aptos Narrow" w:eastAsia="Times New Roman" w:hAnsi="Aptos Narrow" w:cs="Times New Roman"/>
+                <w:color w:val="000000"/>
+              </w:rPr>
+              <w:t>1981</w:t>
+            </w:r>
+          </w:p>
+        </w:tc>
+      </w:tr>
+      <w:tr>
+        <w:trPr>
+          <w:trHeight w:val="300"/>
+        </w:trPr>
+        <w:tc>
+          <w:tcPr>
+            <w:tcW w:w="10900" w:type="dxa"/>
+            <w:tcBorders>
+              <w:top w:val="nil"/>
+              <w:left w:val="nil"/>
+              <w:bottom w:val="nil"/>
+              <w:right w:val="nil"/>
+            </w:tcBorders>
+            <w:noWrap/>
+            <w:vAlign w:val="bottom"/>
+            <w:hideMark/>
+          </w:tcPr>
+          <w:p>
+            <w:pPr>
+              <w:spacing w:before="0" w:after="0" w:line="240" w:lineRule="auto"/>
+              <w:rPr>
+                <w:rFonts w:ascii="Aptos Narrow" w:eastAsia="Times New Roman" w:hAnsi="Aptos Narrow" w:cs="Times New Roman"/>
+                <w:color w:val="000000"/>
+              </w:rPr>
+            </w:pPr>
+            <w:r>
+              <w:rPr>
+                <w:rFonts w:ascii="Aptos Narrow" w:eastAsia="Times New Roman" w:hAnsi="Aptos Narrow" w:cs="Times New Roman"/>
+                <w:color w:val="000000"/>
+              </w:rPr>
+              <w:t>Market Share and Profitability: Testing the Stochastic Hypothesis</w:t>
+            </w:r>
+          </w:p>
+        </w:tc>
+        <w:tc>
+          <w:tcPr>
+            <w:tcW w:w="4677" w:type="dxa"/>
+            <w:tcBorders>
+              <w:top w:val="nil"/>
+              <w:left w:val="nil"/>
+              <w:bottom w:val="nil"/>
+              <w:right w:val="nil"/>
+            </w:tcBorders>
+            <w:noWrap/>
+            <w:vAlign w:val="bottom"/>
+            <w:hideMark/>
+          </w:tcPr>
+          <w:p>
+            <w:pPr>
+              <w:spacing w:before="0" w:after="0" w:line="240" w:lineRule="auto"/>
+              <w:rPr>
+                <w:rFonts w:ascii="Aptos Narrow" w:eastAsia="Times New Roman" w:hAnsi="Aptos Narrow" w:cs="Times New Roman"/>
+                <w:color w:val="000000"/>
+              </w:rPr>
+            </w:pPr>
+            <w:r>
+              <w:rPr>
+                <w:rFonts w:ascii="Aptos Narrow" w:eastAsia="Times New Roman" w:hAnsi="Aptos Narrow" w:cs="Times New Roman"/>
+                <w:color w:val="000000"/>
+              </w:rPr>
+              <w:t>Richard P. Rumelt &amp; Robin C. Wensley</w:t>
+            </w:r>
+          </w:p>
+        </w:tc>
+        <w:tc>
+          <w:tcPr>
+            <w:tcW w:w="960" w:type="dxa"/>
+            <w:tcBorders>
+              <w:top w:val="nil"/>
+              <w:left w:val="nil"/>
+              <w:bottom w:val="nil"/>
+              <w:right w:val="nil"/>
+            </w:tcBorders>
+            <w:noWrap/>
+            <w:vAlign w:val="bottom"/>
+            <w:hideMark/>
+          </w:tcPr>
+          <w:p>
+            <w:pPr>
+              <w:spacing w:before="0" w:after="0" w:line="240" w:lineRule="auto"/>
+              <w:jc w:val="right"/>
+              <w:rPr>
+                <w:rFonts w:ascii="Aptos Narrow" w:eastAsia="Times New Roman" w:hAnsi="Aptos Narrow" w:cs="Times New Roman"/>
+                <w:color w:val="000000"/>
+              </w:rPr>
+            </w:pPr>
+            <w:r>
+              <w:rPr>
+                <w:rFonts w:ascii="Aptos Narrow" w:eastAsia="Times New Roman" w:hAnsi="Aptos Narrow" w:cs="Times New Roman"/>
+                <w:color w:val="000000"/>
+              </w:rPr>
+              <w:t>1981</w:t>
+            </w:r>
+          </w:p>
+        </w:tc>
+      </w:tr>
+      <w:tr>
+        <w:trPr>
+          <w:trHeight w:val="300"/>
+        </w:trPr>
+        <w:tc>
+          <w:tcPr>
+            <w:tcW w:w="10900" w:type="dxa"/>
+            <w:tcBorders>
+              <w:top w:val="nil"/>
+              <w:left w:val="nil"/>
+              <w:bottom w:val="nil"/>
+              <w:right w:val="nil"/>
+            </w:tcBorders>
+            <w:noWrap/>
+            <w:vAlign w:val="bottom"/>
+            <w:hideMark/>
+          </w:tcPr>
+          <w:p>
+            <w:pPr>
+              <w:spacing w:before="0" w:after="0" w:line="240" w:lineRule="auto"/>
+              <w:rPr>
+                <w:rFonts w:ascii="Aptos Narrow" w:eastAsia="Times New Roman" w:hAnsi="Aptos Narrow" w:cs="Times New Roman"/>
+                <w:color w:val="000000"/>
+              </w:rPr>
+            </w:pPr>
+            <w:r>
+              <w:rPr>
+                <w:rFonts w:ascii="Aptos Narrow" w:eastAsia="Times New Roman" w:hAnsi="Aptos Narrow" w:cs="Times New Roman"/>
+                <w:color w:val="000000"/>
+              </w:rPr>
+              <w:t>Diversification and Profitability</w:t>
+            </w:r>
+          </w:p>
+        </w:tc>
+        <w:tc>
+          <w:tcPr>
+            <w:tcW w:w="4677" w:type="dxa"/>
+            <w:tcBorders>
+              <w:top w:val="nil"/>
+              <w:left w:val="nil"/>
+              <w:bottom w:val="nil"/>
+              <w:right w:val="nil"/>
+            </w:tcBorders>
+            <w:noWrap/>
+            <w:vAlign w:val="bottom"/>
+            <w:hideMark/>
+          </w:tcPr>
+          <w:p>
+            <w:pPr>
+              <w:spacing w:before="0" w:after="0" w:line="240" w:lineRule="auto"/>
+              <w:rPr>
+                <w:rFonts w:ascii="Aptos Narrow" w:eastAsia="Times New Roman" w:hAnsi="Aptos Narrow" w:cs="Times New Roman"/>
+                <w:color w:val="000000"/>
+              </w:rPr>
+            </w:pPr>
+            <w:r>
+              <w:rPr>
+                <w:rFonts w:ascii="Aptos Narrow" w:eastAsia="Times New Roman" w:hAnsi="Aptos Narrow" w:cs="Times New Roman"/>
+                <w:color w:val="000000"/>
+              </w:rPr>
+              <w:t>Richard P. Rumelt</w:t>
+            </w:r>
+          </w:p>
+        </w:tc>
+        <w:tc>
+          <w:tcPr>
+            <w:tcW w:w="960" w:type="dxa"/>
+            <w:tcBorders>
+              <w:top w:val="nil"/>
+              <w:left w:val="nil"/>
+              <w:bottom w:val="nil"/>
+              <w:right w:val="nil"/>
+            </w:tcBorders>
+            <w:noWrap/>
+            <w:vAlign w:val="bottom"/>
+            <w:hideMark/>
+          </w:tcPr>
+          <w:p>
+            <w:pPr>
+              <w:spacing w:before="0" w:after="0" w:line="240" w:lineRule="auto"/>
+              <w:jc w:val="right"/>
+              <w:rPr>
+                <w:rFonts w:ascii="Aptos Narrow" w:eastAsia="Times New Roman" w:hAnsi="Aptos Narrow" w:cs="Times New Roman"/>
+                <w:color w:val="000000"/>
+              </w:rPr>
+            </w:pPr>
+            <w:r>
+              <w:rPr>
+                <w:rFonts w:ascii="Aptos Narrow" w:eastAsia="Times New Roman" w:hAnsi="Aptos Narrow" w:cs="Times New Roman"/>
+                <w:color w:val="000000"/>
+              </w:rPr>
+              <w:t>1982</w:t>
+            </w:r>
+          </w:p>
+        </w:tc>
+      </w:tr>
+      <w:tr>
+        <w:trPr>
+          <w:trHeight w:val="300"/>
+        </w:trPr>
+        <w:tc>
+          <w:tcPr>
+            <w:tcW w:w="10900" w:type="dxa"/>
+            <w:tcBorders>
+              <w:top w:val="nil"/>
+              <w:left w:val="nil"/>
+              <w:bottom w:val="nil"/>
+              <w:right w:val="nil"/>
+            </w:tcBorders>
+            <w:noWrap/>
+            <w:vAlign w:val="bottom"/>
+            <w:hideMark/>
+          </w:tcPr>
+          <w:p>
+            <w:pPr>
+              <w:spacing w:before="0" w:after="0" w:line="240" w:lineRule="auto"/>
+              <w:rPr>
+                <w:rFonts w:ascii="Aptos Narrow" w:eastAsia="Times New Roman" w:hAnsi="Aptos Narrow" w:cs="Times New Roman"/>
+                <w:color w:val="000000"/>
+              </w:rPr>
+            </w:pPr>
+            <w:r>
+              <w:rPr>
+                <w:rFonts w:ascii="Aptos Narrow" w:eastAsia="Times New Roman" w:hAnsi="Aptos Narrow" w:cs="Times New Roman"/>
+                <w:color w:val="000000"/>
+              </w:rPr>
+              <w:t>Rumelt Strategy-Structure Database (PDF)</w:t>
+            </w:r>
+          </w:p>
+        </w:tc>
+        <w:tc>
+          <w:tcPr>
+            <w:tcW w:w="4677" w:type="dxa"/>
+            <w:tcBorders>
+              <w:top w:val="nil"/>
+              <w:left w:val="nil"/>
+              <w:bottom w:val="nil"/>
+              <w:right w:val="nil"/>
+            </w:tcBorders>
+            <w:noWrap/>
+            <w:vAlign w:val="bottom"/>
+            <w:hideMark/>
+          </w:tcPr>
+          <w:p>
+            <w:pPr>
+              <w:spacing w:before="0" w:after="0" w:line="240" w:lineRule="auto"/>
+              <w:rPr>
+                <w:rFonts w:ascii="Aptos Narrow" w:eastAsia="Times New Roman" w:hAnsi="Aptos Narrow" w:cs="Times New Roman"/>
+                <w:color w:val="000000"/>
+              </w:rPr>
+            </w:pPr>
+            <w:r>
+              <w:rPr>
+                <w:rFonts w:ascii="Aptos Narrow" w:eastAsia="Times New Roman" w:hAnsi="Aptos Narrow" w:cs="Times New Roman"/>
+                <w:color w:val="000000"/>
+              </w:rPr>
+              <w:t>Richard P. Rumelt</w:t>
+            </w:r>
+          </w:p>
+        </w:tc>
+        <w:tc>
+          <w:tcPr>
+            <w:tcW w:w="960" w:type="dxa"/>
+            <w:tcBorders>
+              <w:top w:val="nil"/>
+              <w:left w:val="nil"/>
+              <w:bottom w:val="nil"/>
+              <w:right w:val="nil"/>
+            </w:tcBorders>
+            <w:noWrap/>
+            <w:vAlign w:val="bottom"/>
+            <w:hideMark/>
+          </w:tcPr>
+          <w:p>
+            <w:pPr>
+              <w:spacing w:before="0" w:after="0" w:line="240" w:lineRule="auto"/>
+              <w:jc w:val="right"/>
+              <w:rPr>
+                <w:rFonts w:ascii="Aptos Narrow" w:eastAsia="Times New Roman" w:hAnsi="Aptos Narrow" w:cs="Times New Roman"/>
+                <w:color w:val="000000"/>
+              </w:rPr>
+            </w:pPr>
+            <w:r>
+              <w:rPr>
+                <w:rFonts w:ascii="Aptos Narrow" w:eastAsia="Times New Roman" w:hAnsi="Aptos Narrow" w:cs="Times New Roman"/>
+                <w:color w:val="000000"/>
+              </w:rPr>
+              <w:t>1982</w:t>
+            </w:r>
+          </w:p>
+        </w:tc>
+      </w:tr>
+      <w:tr>
+        <w:trPr>
+          <w:trHeight w:val="300"/>
+        </w:trPr>
+        <w:tc>
+          <w:tcPr>
+            <w:tcW w:w="10900" w:type="dxa"/>
+            <w:tcBorders>
+              <w:top w:val="nil"/>
+              <w:left w:val="nil"/>
+              <w:bottom w:val="nil"/>
+              <w:right w:val="nil"/>
+            </w:tcBorders>
+            <w:noWrap/>
+            <w:vAlign w:val="bottom"/>
+            <w:hideMark/>
+          </w:tcPr>
+          <w:p>
+            <w:pPr>
+              <w:spacing w:before="0" w:after="0" w:line="240" w:lineRule="auto"/>
+              <w:rPr>
+                <w:rFonts w:ascii="Aptos Narrow" w:eastAsia="Times New Roman" w:hAnsi="Aptos Narrow" w:cs="Times New Roman"/>
+                <w:color w:val="000000"/>
+              </w:rPr>
+            </w:pPr>
+            <w:r>
+              <w:rPr>
+                <w:rFonts w:ascii="Aptos Narrow" w:eastAsia="Times New Roman" w:hAnsi="Aptos Narrow" w:cs="Times New Roman"/>
+                <w:color w:val="000000"/>
+              </w:rPr>
+              <w:lastRenderedPageBreak/>
+              <w:t>Rumelt Strategy-Structure Database (CSV)</w:t>
+            </w:r>
+          </w:p>
+        </w:tc>
+        <w:tc>
+          <w:tcPr>
+            <w:tcW w:w="4677" w:type="dxa"/>
+            <w:tcBorders>
+              <w:top w:val="nil"/>
+              <w:left w:val="nil"/>
+              <w:bottom w:val="nil"/>
+              <w:right w:val="nil"/>
+            </w:tcBorders>
+            <w:noWrap/>
+            <w:vAlign w:val="bottom"/>
+            <w:hideMark/>
+          </w:tcPr>
+          <w:p>
+            <w:pPr>
+              <w:spacing w:before="0" w:after="0" w:line="240" w:lineRule="auto"/>
+              <w:rPr>
+                <w:rFonts w:ascii="Aptos Narrow" w:eastAsia="Times New Roman" w:hAnsi="Aptos Narrow" w:cs="Times New Roman"/>
+                <w:color w:val="000000"/>
+              </w:rPr>
+            </w:pPr>
+            <w:r>
+              <w:rPr>
+                <w:rFonts w:ascii="Aptos Narrow" w:eastAsia="Times New Roman" w:hAnsi="Aptos Narrow" w:cs="Times New Roman"/>
+                <w:color w:val="000000"/>
+              </w:rPr>
+              <w:t>Richard P. Rumelt</w:t>
+            </w:r>
+          </w:p>
+        </w:tc>
+        <w:tc>
+          <w:tcPr>
+            <w:tcW w:w="960" w:type="dxa"/>
+            <w:tcBorders>
+              <w:top w:val="nil"/>
+              <w:left w:val="nil"/>
+              <w:bottom w:val="nil"/>
+              <w:right w:val="nil"/>
+            </w:tcBorders>
+            <w:noWrap/>
+            <w:vAlign w:val="bottom"/>
+            <w:hideMark/>
+          </w:tcPr>
+          <w:p>
+            <w:pPr>
+              <w:spacing w:before="0" w:after="0" w:line="240" w:lineRule="auto"/>
+              <w:jc w:val="right"/>
+              <w:rPr>
+                <w:rFonts w:ascii="Aptos Narrow" w:eastAsia="Times New Roman" w:hAnsi="Aptos Narrow" w:cs="Times New Roman"/>
+                <w:color w:val="000000"/>
+              </w:rPr>
+            </w:pPr>
+            <w:r>
+              <w:rPr>
+                <w:rFonts w:ascii="Aptos Narrow" w:eastAsia="Times New Roman" w:hAnsi="Aptos Narrow" w:cs="Times New Roman"/>
+                <w:color w:val="000000"/>
+              </w:rPr>
+              <w:t>1982</w:t>
+            </w:r>
+          </w:p>
+        </w:tc>
+      </w:tr>
+      <w:tr>
+        <w:trPr>
+          <w:trHeight w:val="300"/>
+        </w:trPr>
+        <w:tc>
+          <w:tcPr>
+            <w:tcW w:w="10900" w:type="dxa"/>
+            <w:tcBorders>
+              <w:top w:val="nil"/>
+              <w:left w:val="nil"/>
+              <w:bottom w:val="nil"/>
+              <w:right w:val="nil"/>
+            </w:tcBorders>
+            <w:noWrap/>
+            <w:vAlign w:val="bottom"/>
+            <w:hideMark/>
+          </w:tcPr>
+          <w:p>
+            <w:pPr>
+              <w:spacing w:before="0" w:after="0" w:line="240" w:lineRule="auto"/>
+              <w:rPr>
+                <w:rFonts w:ascii="Aptos Narrow" w:eastAsia="Times New Roman" w:hAnsi="Aptos Narrow" w:cs="Times New Roman"/>
+                <w:color w:val="000000"/>
+              </w:rPr>
+            </w:pPr>
+            <w:r>
+              <w:rPr>
+                <w:rFonts w:ascii="Aptos Narrow" w:eastAsia="Times New Roman" w:hAnsi="Aptos Narrow" w:cs="Times New Roman"/>
+                <w:color w:val="000000"/>
+              </w:rPr>
+              <w:t>The Analysis of Rents: An Approach to Strategy Work</w:t>
+            </w:r>
+          </w:p>
+        </w:tc>
+        <w:tc>
+          <w:tcPr>
+            <w:tcW w:w="4677" w:type="dxa"/>
+            <w:tcBorders>
+              <w:top w:val="nil"/>
+              <w:left w:val="nil"/>
+              <w:bottom w:val="nil"/>
+              <w:right w:val="nil"/>
+            </w:tcBorders>
+            <w:noWrap/>
+            <w:vAlign w:val="bottom"/>
+            <w:hideMark/>
+          </w:tcPr>
+          <w:p>
+            <w:pPr>
+              <w:spacing w:before="0" w:after="0" w:line="240" w:lineRule="auto"/>
+              <w:rPr>
+                <w:rFonts w:ascii="Aptos Narrow" w:eastAsia="Times New Roman" w:hAnsi="Aptos Narrow" w:cs="Times New Roman"/>
+                <w:color w:val="000000"/>
+              </w:rPr>
+            </w:pPr>
+            <w:r>
+              <w:rPr>
+                <w:rFonts w:ascii="Aptos Narrow" w:eastAsia="Times New Roman" w:hAnsi="Aptos Narrow" w:cs="Times New Roman"/>
+                <w:color w:val="000000"/>
+              </w:rPr>
+              <w:t>Richard P. Rumelt</w:t>
+            </w:r>
+          </w:p>
+        </w:tc>
+        <w:tc>
+          <w:tcPr>
+            <w:tcW w:w="960" w:type="dxa"/>
+            <w:tcBorders>
+              <w:top w:val="nil"/>
+              <w:left w:val="nil"/>
+              <w:bottom w:val="nil"/>
+              <w:right w:val="nil"/>
+            </w:tcBorders>
+            <w:noWrap/>
+            <w:vAlign w:val="bottom"/>
+            <w:hideMark/>
+          </w:tcPr>
+          <w:p>
+            <w:pPr>
+              <w:spacing w:before="0" w:after="0" w:line="240" w:lineRule="auto"/>
+              <w:jc w:val="right"/>
+              <w:rPr>
+                <w:rFonts w:ascii="Aptos Narrow" w:eastAsia="Times New Roman" w:hAnsi="Aptos Narrow" w:cs="Times New Roman"/>
+                <w:color w:val="000000"/>
+              </w:rPr>
+            </w:pPr>
+            <w:r>
+              <w:rPr>
+                <w:rFonts w:ascii="Aptos Narrow" w:eastAsia="Times New Roman" w:hAnsi="Aptos Narrow" w:cs="Times New Roman"/>
+                <w:color w:val="000000"/>
+              </w:rPr>
+              <w:t>1983</w:t>
+            </w:r>
+          </w:p>
+        </w:tc>
+      </w:tr>
+      <w:tr>
+        <w:trPr>
+          <w:trHeight w:val="300"/>
+        </w:trPr>
+        <w:tc>
+          <w:tcPr>
+            <w:tcW w:w="10900" w:type="dxa"/>
+            <w:tcBorders>
+              <w:top w:val="nil"/>
+              <w:left w:val="nil"/>
+              <w:bottom w:val="nil"/>
+              <w:right w:val="nil"/>
+            </w:tcBorders>
+            <w:noWrap/>
+            <w:vAlign w:val="bottom"/>
+            <w:hideMark/>
+          </w:tcPr>
+          <w:p>
+            <w:pPr>
+              <w:spacing w:before="0" w:after="0" w:line="240" w:lineRule="auto"/>
+              <w:rPr>
+                <w:rFonts w:ascii="Aptos Narrow" w:eastAsia="Times New Roman" w:hAnsi="Aptos Narrow" w:cs="Times New Roman"/>
+                <w:color w:val="000000"/>
+              </w:rPr>
+            </w:pPr>
+            <w:proofErr w:type="spellStart"/>
+            <w:r>
+              <w:rPr>
+                <w:rFonts w:ascii="Aptos Narrow" w:eastAsia="Times New Roman" w:hAnsi="Aptos Narrow" w:cs="Times New Roman"/>
+                <w:color w:val="000000"/>
+              </w:rPr>
+              <w:t>Visicorp</w:t>
+            </w:r>
+            <w:proofErr w:type="spellEnd"/>
+            <w:r>
+              <w:rPr>
+                <w:rFonts w:ascii="Aptos Narrow" w:eastAsia="Times New Roman" w:hAnsi="Aptos Narrow" w:cs="Times New Roman"/>
+                <w:color w:val="000000"/>
+              </w:rPr>
+              <w:t xml:space="preserve"> 1978-1984</w:t>
+            </w:r>
+          </w:p>
+        </w:tc>
+        <w:tc>
+          <w:tcPr>
+            <w:tcW w:w="4677" w:type="dxa"/>
+            <w:tcBorders>
+              <w:top w:val="nil"/>
+              <w:left w:val="nil"/>
+              <w:bottom w:val="nil"/>
+              <w:right w:val="nil"/>
+            </w:tcBorders>
+            <w:noWrap/>
+            <w:vAlign w:val="bottom"/>
+            <w:hideMark/>
+          </w:tcPr>
+          <w:p>
+            <w:pPr>
+              <w:spacing w:before="0" w:after="0" w:line="240" w:lineRule="auto"/>
+              <w:rPr>
+                <w:rFonts w:ascii="Aptos Narrow" w:eastAsia="Times New Roman" w:hAnsi="Aptos Narrow" w:cs="Times New Roman"/>
+                <w:color w:val="000000"/>
+              </w:rPr>
+            </w:pPr>
+            <w:r>
+              <w:rPr>
+                <w:rFonts w:ascii="Aptos Narrow" w:eastAsia="Times New Roman" w:hAnsi="Aptos Narrow" w:cs="Times New Roman"/>
+                <w:color w:val="000000"/>
+              </w:rPr>
+              <w:t>Richard P. Rumelt</w:t>
+            </w:r>
+          </w:p>
+        </w:tc>
+        <w:tc>
+          <w:tcPr>
+            <w:tcW w:w="960" w:type="dxa"/>
+            <w:tcBorders>
+              <w:top w:val="nil"/>
+              <w:left w:val="nil"/>
+              <w:bottom w:val="nil"/>
+              <w:right w:val="nil"/>
+            </w:tcBorders>
+            <w:noWrap/>
+            <w:vAlign w:val="bottom"/>
+            <w:hideMark/>
+          </w:tcPr>
+          <w:p>
+            <w:pPr>
+              <w:spacing w:before="0" w:after="0" w:line="240" w:lineRule="auto"/>
+              <w:jc w:val="right"/>
+              <w:rPr>
+                <w:rFonts w:ascii="Aptos Narrow" w:eastAsia="Times New Roman" w:hAnsi="Aptos Narrow" w:cs="Times New Roman"/>
+                <w:color w:val="000000"/>
+              </w:rPr>
+            </w:pPr>
+            <w:r>
+              <w:rPr>
+                <w:rFonts w:ascii="Aptos Narrow" w:eastAsia="Times New Roman" w:hAnsi="Aptos Narrow" w:cs="Times New Roman"/>
+                <w:color w:val="000000"/>
+              </w:rPr>
+              <w:t>1985</w:t>
+            </w:r>
+          </w:p>
+        </w:tc>
+      </w:tr>
+      <w:tr>
+        <w:trPr>
+          <w:trHeight w:val="300"/>
+        </w:trPr>
+        <w:tc>
+          <w:tcPr>
+            <w:tcW w:w="10900" w:type="dxa"/>
+            <w:tcBorders>
+              <w:top w:val="nil"/>
+              <w:left w:val="nil"/>
+              <w:bottom w:val="nil"/>
+              <w:right w:val="nil"/>
+            </w:tcBorders>
+            <w:noWrap/>
+            <w:vAlign w:val="bottom"/>
+            <w:hideMark/>
+          </w:tcPr>
+          <w:p>
+            <w:pPr>
+              <w:spacing w:before="0" w:after="0" w:line="240" w:lineRule="auto"/>
+              <w:rPr>
+                <w:rFonts w:ascii="Aptos Narrow" w:eastAsia="Times New Roman" w:hAnsi="Aptos Narrow" w:cs="Times New Roman"/>
+                <w:color w:val="000000"/>
+              </w:rPr>
+            </w:pPr>
+            <w:r>
+              <w:rPr>
+                <w:rFonts w:ascii="Aptos Narrow" w:eastAsia="Times New Roman" w:hAnsi="Aptos Narrow" w:cs="Times New Roman"/>
+                <w:color w:val="000000"/>
+              </w:rPr>
+              <w:t xml:space="preserve">The </w:t>
+            </w:r>
+            <w:proofErr w:type="spellStart"/>
+            <w:r>
+              <w:rPr>
+                <w:rFonts w:ascii="Aptos Narrow" w:eastAsia="Times New Roman" w:hAnsi="Aptos Narrow" w:cs="Times New Roman"/>
+                <w:color w:val="000000"/>
+              </w:rPr>
+              <w:t>Microsoftware</w:t>
+            </w:r>
+            <w:proofErr w:type="spellEnd"/>
+            <w:r>
+              <w:rPr>
+                <w:rFonts w:ascii="Aptos Narrow" w:eastAsia="Times New Roman" w:hAnsi="Aptos Narrow" w:cs="Times New Roman"/>
+                <w:color w:val="000000"/>
+              </w:rPr>
+              <w:t xml:space="preserve"> Industry 1984</w:t>
+            </w:r>
+          </w:p>
+        </w:tc>
+        <w:tc>
+          <w:tcPr>
+            <w:tcW w:w="4677" w:type="dxa"/>
+            <w:tcBorders>
+              <w:top w:val="nil"/>
+              <w:left w:val="nil"/>
+              <w:bottom w:val="nil"/>
+              <w:right w:val="nil"/>
+            </w:tcBorders>
+            <w:noWrap/>
+            <w:vAlign w:val="bottom"/>
+            <w:hideMark/>
+          </w:tcPr>
+          <w:p>
+            <w:pPr>
+              <w:spacing w:before="0" w:after="0" w:line="240" w:lineRule="auto"/>
+              <w:rPr>
+                <w:rFonts w:ascii="Aptos Narrow" w:eastAsia="Times New Roman" w:hAnsi="Aptos Narrow" w:cs="Times New Roman"/>
+                <w:color w:val="000000"/>
+              </w:rPr>
+            </w:pPr>
+            <w:r>
+              <w:rPr>
+                <w:rFonts w:ascii="Aptos Narrow" w:eastAsia="Times New Roman" w:hAnsi="Aptos Narrow" w:cs="Times New Roman"/>
+                <w:color w:val="000000"/>
+              </w:rPr>
+              <w:t>Richard P. Rumelt</w:t>
+            </w:r>
+          </w:p>
+        </w:tc>
+        <w:tc>
+          <w:tcPr>
+            <w:tcW w:w="960" w:type="dxa"/>
+            <w:tcBorders>
+              <w:top w:val="nil"/>
+              <w:left w:val="nil"/>
+              <w:bottom w:val="nil"/>
+              <w:right w:val="nil"/>
+            </w:tcBorders>
+            <w:noWrap/>
+            <w:vAlign w:val="bottom"/>
+            <w:hideMark/>
+          </w:tcPr>
+          <w:p>
+            <w:pPr>
+              <w:spacing w:before="0" w:after="0" w:line="240" w:lineRule="auto"/>
+              <w:jc w:val="right"/>
+              <w:rPr>
+                <w:rFonts w:ascii="Aptos Narrow" w:eastAsia="Times New Roman" w:hAnsi="Aptos Narrow" w:cs="Times New Roman"/>
+                <w:color w:val="000000"/>
+              </w:rPr>
+            </w:pPr>
+            <w:r>
+              <w:rPr>
+                <w:rFonts w:ascii="Aptos Narrow" w:eastAsia="Times New Roman" w:hAnsi="Aptos Narrow" w:cs="Times New Roman"/>
+                <w:color w:val="000000"/>
+              </w:rPr>
+              <w:t>1985</w:t>
+            </w:r>
+          </w:p>
+        </w:tc>
+      </w:tr>
+      <w:tr>
+        <w:trPr>
+          <w:trHeight w:val="300"/>
+        </w:trPr>
+        <w:tc>
+          <w:tcPr>
+            <w:tcW w:w="10900" w:type="dxa"/>
+            <w:tcBorders>
+              <w:top w:val="nil"/>
+              <w:left w:val="nil"/>
+              <w:bottom w:val="nil"/>
+              <w:right w:val="nil"/>
+            </w:tcBorders>
+            <w:noWrap/>
+            <w:vAlign w:val="bottom"/>
+            <w:hideMark/>
+          </w:tcPr>
+          <w:p>
+            <w:pPr>
+              <w:spacing w:before="0" w:after="0" w:line="240" w:lineRule="auto"/>
+              <w:rPr>
+                <w:rFonts w:ascii="Aptos Narrow" w:eastAsia="Times New Roman" w:hAnsi="Aptos Narrow" w:cs="Times New Roman"/>
+                <w:color w:val="000000"/>
+              </w:rPr>
+            </w:pPr>
+            <w:r>
+              <w:rPr>
+                <w:rFonts w:ascii="Aptos Narrow" w:eastAsia="Times New Roman" w:hAnsi="Aptos Narrow" w:cs="Times New Roman"/>
+                <w:color w:val="000000"/>
+              </w:rPr>
+              <w:t>Markets for Experience Goods with Performance Uncertainty</w:t>
+            </w:r>
+          </w:p>
+        </w:tc>
+        <w:tc>
+          <w:tcPr>
+            <w:tcW w:w="4677" w:type="dxa"/>
+            <w:tcBorders>
+              <w:top w:val="nil"/>
+              <w:left w:val="nil"/>
+              <w:bottom w:val="nil"/>
+              <w:right w:val="nil"/>
+            </w:tcBorders>
+            <w:noWrap/>
+            <w:vAlign w:val="bottom"/>
+            <w:hideMark/>
+          </w:tcPr>
+          <w:p>
+            <w:pPr>
+              <w:spacing w:before="0" w:after="0" w:line="240" w:lineRule="auto"/>
+              <w:rPr>
+                <w:rFonts w:ascii="Aptos Narrow" w:eastAsia="Times New Roman" w:hAnsi="Aptos Narrow" w:cs="Times New Roman"/>
+                <w:color w:val="000000"/>
+              </w:rPr>
+            </w:pPr>
+            <w:r>
+              <w:rPr>
+                <w:rFonts w:ascii="Aptos Narrow" w:eastAsia="Times New Roman" w:hAnsi="Aptos Narrow" w:cs="Times New Roman"/>
+                <w:color w:val="000000"/>
+              </w:rPr>
+              <w:t>Julia Liebeskind &amp; Richard P. Rumelt</w:t>
+            </w:r>
+          </w:p>
+        </w:tc>
+        <w:tc>
+          <w:tcPr>
+            <w:tcW w:w="960" w:type="dxa"/>
+            <w:tcBorders>
+              <w:top w:val="nil"/>
+              <w:left w:val="nil"/>
+              <w:bottom w:val="nil"/>
+              <w:right w:val="nil"/>
+            </w:tcBorders>
+            <w:noWrap/>
+            <w:vAlign w:val="bottom"/>
+            <w:hideMark/>
+          </w:tcPr>
+          <w:p>
+            <w:pPr>
+              <w:spacing w:before="0" w:after="0" w:line="240" w:lineRule="auto"/>
+              <w:jc w:val="right"/>
+              <w:rPr>
+                <w:rFonts w:ascii="Aptos Narrow" w:eastAsia="Times New Roman" w:hAnsi="Aptos Narrow" w:cs="Times New Roman"/>
+                <w:color w:val="000000"/>
+              </w:rPr>
+            </w:pPr>
+            <w:r>
+              <w:rPr>
+                <w:rFonts w:ascii="Aptos Narrow" w:eastAsia="Times New Roman" w:hAnsi="Aptos Narrow" w:cs="Times New Roman"/>
+                <w:color w:val="000000"/>
+              </w:rPr>
+              <w:t>1989</w:t>
+            </w:r>
+          </w:p>
+        </w:tc>
+      </w:tr>
+      <w:tr>
+        <w:trPr>
+          <w:trHeight w:val="300"/>
+        </w:trPr>
+        <w:tc>
+          <w:tcPr>
+            <w:tcW w:w="10900" w:type="dxa"/>
+            <w:tcBorders>
+              <w:top w:val="nil"/>
+              <w:left w:val="nil"/>
+              <w:bottom w:val="nil"/>
+              <w:right w:val="nil"/>
+            </w:tcBorders>
+            <w:noWrap/>
+            <w:vAlign w:val="bottom"/>
+            <w:hideMark/>
+          </w:tcPr>
+          <w:p>
+            <w:pPr>
+              <w:spacing w:before="0" w:after="0" w:line="240" w:lineRule="auto"/>
+              <w:rPr>
+                <w:rFonts w:ascii="Aptos Narrow" w:eastAsia="Times New Roman" w:hAnsi="Aptos Narrow" w:cs="Times New Roman"/>
+                <w:color w:val="000000"/>
+              </w:rPr>
+            </w:pPr>
+            <w:r>
+              <w:rPr>
+                <w:rFonts w:ascii="Aptos Narrow" w:eastAsia="Times New Roman" w:hAnsi="Aptos Narrow" w:cs="Times New Roman"/>
+                <w:color w:val="000000"/>
+              </w:rPr>
+              <w:t>How Much Does Industry Matter?</w:t>
+            </w:r>
+          </w:p>
+        </w:tc>
+        <w:tc>
+          <w:tcPr>
+            <w:tcW w:w="4677" w:type="dxa"/>
+            <w:tcBorders>
+              <w:top w:val="nil"/>
+              <w:left w:val="nil"/>
+              <w:bottom w:val="nil"/>
+              <w:right w:val="nil"/>
+            </w:tcBorders>
+            <w:noWrap/>
+            <w:vAlign w:val="bottom"/>
+            <w:hideMark/>
+          </w:tcPr>
+          <w:p>
+            <w:pPr>
+              <w:spacing w:before="0" w:after="0" w:line="240" w:lineRule="auto"/>
+              <w:rPr>
+                <w:rFonts w:ascii="Aptos Narrow" w:eastAsia="Times New Roman" w:hAnsi="Aptos Narrow" w:cs="Times New Roman"/>
+                <w:color w:val="000000"/>
+              </w:rPr>
+            </w:pPr>
+            <w:r>
+              <w:rPr>
+                <w:rFonts w:ascii="Aptos Narrow" w:eastAsia="Times New Roman" w:hAnsi="Aptos Narrow" w:cs="Times New Roman"/>
+                <w:color w:val="000000"/>
+              </w:rPr>
+              <w:t>Richard P. Rumelt</w:t>
+            </w:r>
+          </w:p>
+        </w:tc>
+        <w:tc>
+          <w:tcPr>
+            <w:tcW w:w="960" w:type="dxa"/>
+            <w:tcBorders>
+              <w:top w:val="nil"/>
+              <w:left w:val="nil"/>
+              <w:bottom w:val="nil"/>
+              <w:right w:val="nil"/>
+            </w:tcBorders>
+            <w:noWrap/>
+            <w:vAlign w:val="bottom"/>
+            <w:hideMark/>
+          </w:tcPr>
+          <w:p>
+            <w:pPr>
+              <w:spacing w:before="0" w:after="0" w:line="240" w:lineRule="auto"/>
+              <w:jc w:val="right"/>
+              <w:rPr>
+                <w:rFonts w:ascii="Aptos Narrow" w:eastAsia="Times New Roman" w:hAnsi="Aptos Narrow" w:cs="Times New Roman"/>
+                <w:color w:val="000000"/>
+              </w:rPr>
+            </w:pPr>
+            <w:r>
+              <w:rPr>
+                <w:rFonts w:ascii="Aptos Narrow" w:eastAsia="Times New Roman" w:hAnsi="Aptos Narrow" w:cs="Times New Roman"/>
+                <w:color w:val="000000"/>
+              </w:rPr>
+              <w:t>1991</w:t>
+            </w:r>
+          </w:p>
+        </w:tc>
+      </w:tr>
+      <w:tr>
+        <w:trPr>
+          <w:trHeight w:val="300"/>
+        </w:trPr>
+        <w:tc>
+          <w:tcPr>
+            <w:tcW w:w="10900" w:type="dxa"/>
+            <w:tcBorders>
+              <w:top w:val="nil"/>
+              <w:left w:val="nil"/>
+              <w:bottom w:val="nil"/>
+              <w:right w:val="nil"/>
+            </w:tcBorders>
+            <w:noWrap/>
+            <w:vAlign w:val="bottom"/>
+            <w:hideMark/>
+          </w:tcPr>
+          <w:p>
+            <w:pPr>
+              <w:spacing w:before="0" w:after="0" w:line="240" w:lineRule="auto"/>
+              <w:rPr>
+                <w:rFonts w:ascii="Aptos Narrow" w:eastAsia="Times New Roman" w:hAnsi="Aptos Narrow" w:cs="Times New Roman"/>
+                <w:color w:val="000000"/>
+              </w:rPr>
+            </w:pPr>
+            <w:r>
+              <w:rPr>
+                <w:rFonts w:ascii="Aptos Narrow" w:eastAsia="Times New Roman" w:hAnsi="Aptos Narrow" w:cs="Times New Roman"/>
+                <w:color w:val="000000"/>
+              </w:rPr>
+              <w:t>Heterogeneity Under Competition</w:t>
+            </w:r>
+          </w:p>
+        </w:tc>
+        <w:tc>
+          <w:tcPr>
+            <w:tcW w:w="4677" w:type="dxa"/>
+            <w:tcBorders>
+              <w:top w:val="nil"/>
+              <w:left w:val="nil"/>
+              <w:bottom w:val="nil"/>
+              <w:right w:val="nil"/>
+            </w:tcBorders>
+            <w:noWrap/>
+            <w:vAlign w:val="bottom"/>
+            <w:hideMark/>
+          </w:tcPr>
+          <w:p>
+            <w:pPr>
+              <w:spacing w:before="0" w:after="0" w:line="240" w:lineRule="auto"/>
+              <w:rPr>
+                <w:rFonts w:ascii="Aptos Narrow" w:eastAsia="Times New Roman" w:hAnsi="Aptos Narrow" w:cs="Times New Roman"/>
+                <w:color w:val="000000"/>
+              </w:rPr>
+            </w:pPr>
+            <w:r>
+              <w:rPr>
+                <w:rFonts w:ascii="Aptos Narrow" w:eastAsia="Times New Roman" w:hAnsi="Aptos Narrow" w:cs="Times New Roman"/>
+                <w:color w:val="000000"/>
+              </w:rPr>
+              <w:t>Steven A. Lippman, Kevin F. McCardle</w:t>
+            </w:r>
+          </w:p>
+        </w:tc>
+        <w:tc>
+          <w:tcPr>
+            <w:tcW w:w="960" w:type="dxa"/>
+            <w:tcBorders>
+              <w:top w:val="nil"/>
+              <w:left w:val="nil"/>
+              <w:bottom w:val="nil"/>
+              <w:right w:val="nil"/>
+            </w:tcBorders>
+            <w:noWrap/>
+            <w:vAlign w:val="bottom"/>
+            <w:hideMark/>
+          </w:tcPr>
+          <w:p>
+            <w:pPr>
+              <w:spacing w:before="0" w:after="0" w:line="240" w:lineRule="auto"/>
+              <w:jc w:val="right"/>
+              <w:rPr>
+                <w:rFonts w:ascii="Aptos Narrow" w:eastAsia="Times New Roman" w:hAnsi="Aptos Narrow" w:cs="Times New Roman"/>
+                <w:color w:val="000000"/>
+              </w:rPr>
+            </w:pPr>
+            <w:r>
+              <w:rPr>
+                <w:rFonts w:ascii="Aptos Narrow" w:eastAsia="Times New Roman" w:hAnsi="Aptos Narrow" w:cs="Times New Roman"/>
+                <w:color w:val="000000"/>
+              </w:rPr>
+              <w:t>1991</w:t>
+            </w:r>
+          </w:p>
+        </w:tc>
+      </w:tr>
+      <w:tr>
+        <w:trPr>
+          <w:trHeight w:val="300"/>
+        </w:trPr>
+        <w:tc>
+          <w:tcPr>
+            <w:tcW w:w="10900" w:type="dxa"/>
+            <w:tcBorders>
+              <w:top w:val="nil"/>
+              <w:left w:val="nil"/>
+              <w:bottom w:val="nil"/>
+              <w:right w:val="nil"/>
+            </w:tcBorders>
+            <w:noWrap/>
+            <w:vAlign w:val="bottom"/>
+            <w:hideMark/>
+          </w:tcPr>
+          <w:p>
+            <w:pPr>
+              <w:spacing w:before="0" w:after="0" w:line="240" w:lineRule="auto"/>
+              <w:rPr>
+                <w:rFonts w:ascii="Aptos Narrow" w:eastAsia="Times New Roman" w:hAnsi="Aptos Narrow" w:cs="Times New Roman"/>
+                <w:color w:val="000000"/>
+              </w:rPr>
+            </w:pPr>
+            <w:r>
+              <w:rPr>
+                <w:rFonts w:ascii="Aptos Narrow" w:eastAsia="Times New Roman" w:hAnsi="Aptos Narrow" w:cs="Times New Roman"/>
+                <w:color w:val="000000"/>
+              </w:rPr>
+              <w:t>Software Piracy: An Analysis of Protection Strategies</w:t>
+            </w:r>
+          </w:p>
+        </w:tc>
+        <w:tc>
+          <w:tcPr>
+            <w:tcW w:w="4677" w:type="dxa"/>
+            <w:tcBorders>
+              <w:top w:val="nil"/>
+              <w:left w:val="nil"/>
+              <w:bottom w:val="nil"/>
+              <w:right w:val="nil"/>
+            </w:tcBorders>
+            <w:noWrap/>
+            <w:vAlign w:val="bottom"/>
+            <w:hideMark/>
+          </w:tcPr>
+          <w:p>
+            <w:pPr>
+              <w:spacing w:before="0" w:after="0" w:line="240" w:lineRule="auto"/>
+              <w:rPr>
+                <w:rFonts w:ascii="Aptos Narrow" w:eastAsia="Times New Roman" w:hAnsi="Aptos Narrow" w:cs="Times New Roman"/>
+                <w:color w:val="000000"/>
+              </w:rPr>
+            </w:pPr>
+            <w:r>
+              <w:rPr>
+                <w:rFonts w:ascii="Aptos Narrow" w:eastAsia="Times New Roman" w:hAnsi="Aptos Narrow" w:cs="Times New Roman"/>
+                <w:color w:val="000000"/>
+              </w:rPr>
+              <w:t>Kathleen Reavis Conner &amp; Richard P. Rumelt</w:t>
+            </w:r>
+          </w:p>
+        </w:tc>
+        <w:tc>
+          <w:tcPr>
+            <w:tcW w:w="960" w:type="dxa"/>
+            <w:tcBorders>
+              <w:top w:val="nil"/>
+              <w:left w:val="nil"/>
+              <w:bottom w:val="nil"/>
+              <w:right w:val="nil"/>
+            </w:tcBorders>
+            <w:noWrap/>
+            <w:vAlign w:val="bottom"/>
+            <w:hideMark/>
+          </w:tcPr>
+          <w:p>
+            <w:pPr>
+              <w:spacing w:before="0" w:after="0" w:line="240" w:lineRule="auto"/>
+              <w:jc w:val="right"/>
+              <w:rPr>
+                <w:rFonts w:ascii="Aptos Narrow" w:eastAsia="Times New Roman" w:hAnsi="Aptos Narrow" w:cs="Times New Roman"/>
+                <w:color w:val="000000"/>
+              </w:rPr>
+            </w:pPr>
+            <w:r>
+              <w:rPr>
+                <w:rFonts w:ascii="Aptos Narrow" w:eastAsia="Times New Roman" w:hAnsi="Aptos Narrow" w:cs="Times New Roman"/>
+                <w:color w:val="000000"/>
+              </w:rPr>
+              <w:t>1991</w:t>
+            </w:r>
+          </w:p>
+        </w:tc>
+      </w:tr>
+      <w:tr>
+        <w:trPr>
+          <w:trHeight w:val="300"/>
+        </w:trPr>
+        <w:tc>
+          <w:tcPr>
+            <w:tcW w:w="10900" w:type="dxa"/>
+            <w:tcBorders>
+              <w:top w:val="nil"/>
+              <w:left w:val="nil"/>
+              <w:bottom w:val="nil"/>
+              <w:right w:val="nil"/>
+            </w:tcBorders>
+            <w:noWrap/>
+            <w:vAlign w:val="bottom"/>
+            <w:hideMark/>
+          </w:tcPr>
+          <w:p>
+            <w:pPr>
+              <w:spacing w:before="0" w:after="0" w:line="240" w:lineRule="auto"/>
+              <w:rPr>
+                <w:rFonts w:ascii="Aptos Narrow" w:eastAsia="Times New Roman" w:hAnsi="Aptos Narrow" w:cs="Times New Roman"/>
+                <w:color w:val="000000"/>
+              </w:rPr>
+            </w:pPr>
+            <w:r>
+              <w:rPr>
+                <w:rFonts w:ascii="Aptos Narrow" w:eastAsia="Times New Roman" w:hAnsi="Aptos Narrow" w:cs="Times New Roman"/>
+                <w:color w:val="000000"/>
+              </w:rPr>
+              <w:t>Strategic Management and Economics</w:t>
+            </w:r>
+          </w:p>
+        </w:tc>
+        <w:tc>
+          <w:tcPr>
+            <w:tcW w:w="4677" w:type="dxa"/>
+            <w:tcBorders>
+              <w:top w:val="nil"/>
+              <w:left w:val="nil"/>
+              <w:bottom w:val="nil"/>
+              <w:right w:val="nil"/>
+            </w:tcBorders>
+            <w:noWrap/>
+            <w:vAlign w:val="bottom"/>
+            <w:hideMark/>
+          </w:tcPr>
+          <w:p>
+            <w:pPr>
+              <w:spacing w:before="0" w:after="0" w:line="240" w:lineRule="auto"/>
+              <w:rPr>
+                <w:rFonts w:ascii="Aptos Narrow" w:eastAsia="Times New Roman" w:hAnsi="Aptos Narrow" w:cs="Times New Roman"/>
+                <w:color w:val="000000"/>
+              </w:rPr>
+            </w:pPr>
+            <w:r>
+              <w:rPr>
+                <w:rFonts w:ascii="Aptos Narrow" w:eastAsia="Times New Roman" w:hAnsi="Aptos Narrow" w:cs="Times New Roman"/>
+                <w:color w:val="000000"/>
+              </w:rPr>
+              <w:t>Richard P. Rumelt &amp; Dan E. Schendel &amp; David J. Teece</w:t>
+            </w:r>
+          </w:p>
+        </w:tc>
+        <w:tc>
+          <w:tcPr>
+            <w:tcW w:w="960" w:type="dxa"/>
+            <w:tcBorders>
+              <w:top w:val="nil"/>
+              <w:left w:val="nil"/>
+              <w:bottom w:val="nil"/>
+              <w:right w:val="nil"/>
+            </w:tcBorders>
+            <w:noWrap/>
+            <w:vAlign w:val="bottom"/>
+            <w:hideMark/>
+          </w:tcPr>
+          <w:p>
+            <w:pPr>
+              <w:spacing w:before="0" w:after="0" w:line="240" w:lineRule="auto"/>
+              <w:jc w:val="right"/>
+              <w:rPr>
+                <w:rFonts w:ascii="Aptos Narrow" w:eastAsia="Times New Roman" w:hAnsi="Aptos Narrow" w:cs="Times New Roman"/>
+                <w:color w:val="000000"/>
+              </w:rPr>
+            </w:pPr>
+            <w:r>
+              <w:rPr>
+                <w:rFonts w:ascii="Aptos Narrow" w:eastAsia="Times New Roman" w:hAnsi="Aptos Narrow" w:cs="Times New Roman"/>
+                <w:color w:val="000000"/>
+              </w:rPr>
+              <w:t>1991</w:t>
+            </w:r>
+          </w:p>
+        </w:tc>
+      </w:tr>
+      <w:tr>
+        <w:trPr>
+          <w:trHeight w:val="300"/>
+        </w:trPr>
+        <w:tc>
+          <w:tcPr>
+            <w:tcW w:w="10900" w:type="dxa"/>
+            <w:tcBorders>
+              <w:top w:val="nil"/>
+              <w:left w:val="nil"/>
+              <w:bottom w:val="nil"/>
+              <w:right w:val="nil"/>
+            </w:tcBorders>
+            <w:noWrap/>
+            <w:vAlign w:val="bottom"/>
+            <w:hideMark/>
+          </w:tcPr>
+          <w:p>
+            <w:pPr>
+              <w:spacing w:before="0" w:after="0" w:line="240" w:lineRule="auto"/>
+              <w:rPr>
+                <w:rFonts w:ascii="Aptos Narrow" w:eastAsia="Times New Roman" w:hAnsi="Aptos Narrow" w:cs="Times New Roman"/>
+                <w:color w:val="000000"/>
+              </w:rPr>
+            </w:pPr>
+            <w:r>
+              <w:rPr>
+                <w:rFonts w:ascii="Aptos Narrow" w:eastAsia="Times New Roman" w:hAnsi="Aptos Narrow" w:cs="Times New Roman"/>
+                <w:color w:val="000000"/>
+              </w:rPr>
+              <w:t>Demand Uncertainty, Capital Specificity, and Industrial Evolution</w:t>
+            </w:r>
+          </w:p>
+        </w:tc>
+        <w:tc>
+          <w:tcPr>
+            <w:tcW w:w="4677" w:type="dxa"/>
+            <w:tcBorders>
+              <w:top w:val="nil"/>
+              <w:left w:val="nil"/>
+              <w:bottom w:val="nil"/>
+              <w:right w:val="nil"/>
+            </w:tcBorders>
+            <w:noWrap/>
+            <w:vAlign w:val="bottom"/>
+            <w:hideMark/>
+          </w:tcPr>
+          <w:p>
+            <w:pPr>
+              <w:spacing w:before="0" w:after="0" w:line="240" w:lineRule="auto"/>
+              <w:rPr>
+                <w:rFonts w:ascii="Aptos Narrow" w:eastAsia="Times New Roman" w:hAnsi="Aptos Narrow" w:cs="Times New Roman"/>
+                <w:color w:val="000000"/>
+              </w:rPr>
+            </w:pPr>
+            <w:r>
+              <w:rPr>
+                <w:rFonts w:ascii="Aptos Narrow" w:eastAsia="Times New Roman" w:hAnsi="Aptos Narrow" w:cs="Times New Roman"/>
+                <w:color w:val="000000"/>
+              </w:rPr>
+              <w:t>Steven A. Lippman &amp; Richard P. Rumelt</w:t>
+            </w:r>
+          </w:p>
+        </w:tc>
+        <w:tc>
+          <w:tcPr>
+            <w:tcW w:w="960" w:type="dxa"/>
+            <w:tcBorders>
+              <w:top w:val="nil"/>
+              <w:left w:val="nil"/>
+              <w:bottom w:val="nil"/>
+              <w:right w:val="nil"/>
+            </w:tcBorders>
+            <w:noWrap/>
+            <w:vAlign w:val="bottom"/>
+            <w:hideMark/>
+          </w:tcPr>
+          <w:p>
+            <w:pPr>
+              <w:spacing w:before="0" w:after="0" w:line="240" w:lineRule="auto"/>
+              <w:jc w:val="right"/>
+              <w:rPr>
+                <w:rFonts w:ascii="Aptos Narrow" w:eastAsia="Times New Roman" w:hAnsi="Aptos Narrow" w:cs="Times New Roman"/>
+                <w:color w:val="000000"/>
+              </w:rPr>
+            </w:pPr>
+            <w:r>
+              <w:rPr>
+                <w:rFonts w:ascii="Aptos Narrow" w:eastAsia="Times New Roman" w:hAnsi="Aptos Narrow" w:cs="Times New Roman"/>
+                <w:color w:val="000000"/>
+              </w:rPr>
+              <w:t>1992</w:t>
+            </w:r>
+          </w:p>
+        </w:tc>
+      </w:tr>
+      <w:tr>
+        <w:trPr>
+          <w:trHeight w:val="300"/>
+        </w:trPr>
+        <w:tc>
+          <w:tcPr>
+            <w:tcW w:w="10900" w:type="dxa"/>
+            <w:tcBorders>
+              <w:top w:val="nil"/>
+              <w:left w:val="nil"/>
+              <w:bottom w:val="nil"/>
+              <w:right w:val="nil"/>
+            </w:tcBorders>
+            <w:noWrap/>
+            <w:vAlign w:val="bottom"/>
+            <w:hideMark/>
+          </w:tcPr>
+          <w:p>
+            <w:pPr>
+              <w:spacing w:before="0" w:after="0" w:line="240" w:lineRule="auto"/>
+              <w:rPr>
+                <w:rFonts w:ascii="Aptos Narrow" w:eastAsia="Times New Roman" w:hAnsi="Aptos Narrow" w:cs="Times New Roman"/>
+                <w:color w:val="000000"/>
+              </w:rPr>
+            </w:pPr>
+            <w:r>
+              <w:rPr>
+                <w:rFonts w:ascii="Aptos Narrow" w:eastAsia="Times New Roman" w:hAnsi="Aptos Narrow" w:cs="Times New Roman"/>
+                <w:color w:val="000000"/>
+              </w:rPr>
+              <w:t>Incentives, Routines &amp; Self-Command</w:t>
+            </w:r>
+          </w:p>
+        </w:tc>
+        <w:tc>
+          <w:tcPr>
+            <w:tcW w:w="4677" w:type="dxa"/>
+            <w:tcBorders>
+              <w:top w:val="nil"/>
+              <w:left w:val="nil"/>
+              <w:bottom w:val="nil"/>
+              <w:right w:val="nil"/>
+            </w:tcBorders>
+            <w:noWrap/>
+            <w:vAlign w:val="bottom"/>
+            <w:hideMark/>
+          </w:tcPr>
+          <w:p>
+            <w:pPr>
+              <w:spacing w:before="0" w:after="0" w:line="240" w:lineRule="auto"/>
+              <w:rPr>
+                <w:rFonts w:ascii="Aptos Narrow" w:eastAsia="Times New Roman" w:hAnsi="Aptos Narrow" w:cs="Times New Roman"/>
+                <w:color w:val="000000"/>
+              </w:rPr>
+            </w:pPr>
+            <w:r>
+              <w:rPr>
+                <w:rFonts w:ascii="Aptos Narrow" w:eastAsia="Times New Roman" w:hAnsi="Aptos Narrow" w:cs="Times New Roman"/>
+                <w:color w:val="000000"/>
+              </w:rPr>
+              <w:t>Steven Postrel &amp; Richard P. Rumelt</w:t>
+            </w:r>
+          </w:p>
+        </w:tc>
+        <w:tc>
+          <w:tcPr>
+            <w:tcW w:w="960" w:type="dxa"/>
+            <w:tcBorders>
+              <w:top w:val="nil"/>
+              <w:left w:val="nil"/>
+              <w:bottom w:val="nil"/>
+              <w:right w:val="nil"/>
+            </w:tcBorders>
+            <w:noWrap/>
+            <w:vAlign w:val="bottom"/>
+            <w:hideMark/>
+          </w:tcPr>
+          <w:p>
+            <w:pPr>
+              <w:spacing w:before="0" w:after="0" w:line="240" w:lineRule="auto"/>
+              <w:jc w:val="right"/>
+              <w:rPr>
+                <w:rFonts w:ascii="Aptos Narrow" w:eastAsia="Times New Roman" w:hAnsi="Aptos Narrow" w:cs="Times New Roman"/>
+                <w:color w:val="000000"/>
+              </w:rPr>
+            </w:pPr>
+            <w:r>
+              <w:rPr>
+                <w:rFonts w:ascii="Aptos Narrow" w:eastAsia="Times New Roman" w:hAnsi="Aptos Narrow" w:cs="Times New Roman"/>
+                <w:color w:val="000000"/>
+              </w:rPr>
+              <w:t>1992</w:t>
+            </w:r>
+          </w:p>
+        </w:tc>
+      </w:tr>
+    </w:tbl>
+    <w:p>
+      <w:pPr>
+        <w:pStyle w:val="PlainText"/>
+        <w:rPr>
+          <w:rFonts w:asciiTheme="minorHAnsi" w:hAnsiTheme="minorHAnsi" w:cs="Courier New"/>
+          <w:sz w:val="24"/>
+          <w:szCs w:val="24"/>
+        </w:rPr>
+      </w:pPr>
     </w:p>
     <w:p>
       <w:pPr>
@@ -1571,7 +3242,23 @@
           <w:sz w:val="24"/>
           <w:szCs w:val="24"/>
         </w:rPr>
-        <w:t>I returned to UCLA Anderson in 1996. In that year I also received the Strategic Management Journal’s Best Paper award for “How Much Does Industry Matter?”</w:t>
+        <w:t>I returned to UCLA Anderson in 1996. In that year</w:t>
+      </w:r>
+      <w:r>
+        <w:rPr>
+          <w:rFonts w:asciiTheme="minorHAnsi" w:hAnsiTheme="minorHAnsi" w:cs="Courier New"/>
+          <w:sz w:val="24"/>
+          <w:szCs w:val="24"/>
+        </w:rPr>
+        <w:t>,</w:t>
+      </w:r>
+      <w:r>
+        <w:rPr>
+          <w:rFonts w:asciiTheme="minorHAnsi" w:hAnsiTheme="minorHAnsi" w:cs="Courier New"/>
+          <w:sz w:val="24"/>
+          <w:szCs w:val="24"/>
+        </w:rPr>
+        <w:t xml:space="preserve"> I also received the Strategic Management Journal’s Best Paper award for “How Much Does Industry Matter?”</w:t>
       </w:r>
     </w:p>
     <w:p>
@@ -1597,7 +3284,23 @@
           <w:sz w:val="24"/>
           <w:szCs w:val="24"/>
         </w:rPr>
-        <w:t xml:space="preserve">  As Kate says, we love exploring new places, and living in them is a good way.</w:t>
+        <w:t xml:space="preserve">  As Kate says, we love exploring new places, and living in them is a good way</w:t>
+      </w:r>
+      <w:r>
+        <w:rPr>
+          <w:rFonts w:asciiTheme="minorHAnsi" w:hAnsiTheme="minorHAnsi" w:cs="Courier New"/>
+          <w:sz w:val="24"/>
+          <w:szCs w:val="24"/>
+        </w:rPr>
+        <w:t xml:space="preserve"> to do so</w:t>
+      </w:r>
+      <w:r>
+        <w:rPr>
+          <w:rFonts w:asciiTheme="minorHAnsi" w:hAnsiTheme="minorHAnsi" w:cs="Courier New"/>
+          <w:sz w:val="24"/>
+          <w:szCs w:val="24"/>
+        </w:rPr>
+        <w:t>.</w:t>
       </w:r>
     </w:p>
     <w:p>

</xml_diff>